<commit_message>
update mixed teams records document
</commit_message>
<xml_diff>
--- a/_data/records/records_mixed_teams.docx
+++ b/_data/records/records_mixed_teams.docx
@@ -128,31 +128,14 @@
           <w:rtl w:val="0"/>
           <w:lang w:val="ru-RU"/>
         </w:rPr>
-        <w:t xml:space="preserve">еред </w:t>
-      </w:r>
-      <w:r>
-        <w:rPr>
-          <w:b w:val="1"/>
-          <w:bCs w:val="1"/>
-          <w:rtl w:val="0"/>
-        </w:rPr>
-        <w:t>змішан</w:t>
-      </w:r>
-      <w:r>
-        <w:rPr>
-          <w:b w:val="1"/>
-          <w:bCs w:val="1"/>
-          <w:rtl w:val="0"/>
-          <w:lang w:val="ru-RU"/>
-        </w:rPr>
-        <w:t xml:space="preserve">их команд </w:t>
+        <w:t xml:space="preserve">еред змішаних команд </w:t>
       </w:r>
     </w:p>
     <w:tbl>
       <w:tblPr>
-        <w:tblW w:w="14785" w:type="dxa"/>
+        <w:tblW w:w="14784" w:type="dxa"/>
         <w:jc w:val="center"/>
-        <w:tblInd w:w="108" w:type="dxa"/>
+        <w:tblInd w:w="216" w:type="dxa"/>
         <w:tblBorders>
           <w:top w:val="single" w:color="ffffff" w:sz="8" w:space="0" w:shadow="0" w:frame="0"/>
           <w:left w:val="single" w:color="ffffff" w:sz="8" w:space="0" w:shadow="0" w:frame="0"/>
@@ -170,7 +153,7 @@
         <w:gridCol w:w="1700"/>
         <w:gridCol w:w="3118"/>
         <w:gridCol w:w="2553"/>
-        <w:gridCol w:w="1216"/>
+        <w:gridCol w:w="1215"/>
         <w:gridCol w:w="1837"/>
       </w:tblGrid>
       <w:tr>
@@ -178,7 +161,7 @@
           <w:shd w:val="clear" w:color="auto" w:fill="ced7e7"/>
         </w:tblPrEx>
         <w:trPr>
-          <w:trHeight w:val="300" w:hRule="atLeast"/>
+          <w:trHeight w:val="310" w:hRule="atLeast"/>
         </w:trPr>
         <w:tc>
           <w:tcPr>
@@ -281,7 +264,7 @@
         </w:tc>
         <w:tc>
           <w:tcPr>
-            <w:tcW w:type="dxa" w:w="3117"/>
+            <w:tcW w:type="dxa" w:w="3118"/>
             <w:tcBorders>
               <w:top w:val="single" w:color="000000" w:sz="4" w:space="0" w:shadow="0" w:frame="0"/>
               <w:left w:val="single" w:color="000000" w:sz="4" w:space="0" w:shadow="0" w:frame="0"/>
@@ -330,7 +313,7 @@
         </w:tc>
         <w:tc>
           <w:tcPr>
-            <w:tcW w:type="dxa" w:w="2552"/>
+            <w:tcW w:type="dxa" w:w="2553"/>
             <w:tcBorders>
               <w:top w:val="single" w:color="000000" w:sz="4" w:space="0" w:shadow="0" w:frame="0"/>
               <w:left w:val="single" w:color="000000" w:sz="4" w:space="0" w:shadow="0" w:frame="0"/>
@@ -395,7 +378,7 @@
         </w:tc>
         <w:tc>
           <w:tcPr>
-            <w:tcW w:type="dxa" w:w="1216"/>
+            <w:tcW w:type="dxa" w:w="1215"/>
             <w:tcBorders>
               <w:top w:val="single" w:color="000000" w:sz="4" w:space="0" w:shadow="0" w:frame="0"/>
               <w:left w:val="single" w:color="000000" w:sz="4" w:space="0" w:shadow="0" w:frame="0"/>
@@ -428,30 +411,31 @@
         </w:tc>
         <w:tc>
           <w:tcPr>
-            <w:tcW w:type="dxa" w:w="1836"/>
-            <w:tcBorders>
-              <w:top w:val="single" w:color="000000" w:sz="4" w:space="0" w:shadow="0" w:frame="0"/>
-              <w:left w:val="single" w:color="000000" w:sz="4" w:space="0" w:shadow="0" w:frame="0"/>
-              <w:bottom w:val="single" w:color="000000" w:sz="4" w:space="0" w:shadow="0" w:frame="0"/>
-              <w:right w:val="single" w:color="000000" w:sz="4" w:space="0" w:shadow="0" w:frame="0"/>
-            </w:tcBorders>
-            <w:shd w:val="clear" w:color="auto" w:fill="auto"/>
-            <w:tcMar>
-              <w:top w:type="dxa" w:w="80"/>
-              <w:left w:type="dxa" w:w="80"/>
-              <w:bottom w:type="dxa" w:w="80"/>
-              <w:right w:type="dxa" w:w="80"/>
-            </w:tcMar>
-            <w:vAlign w:val="top"/>
-          </w:tcPr>
-          <w:p>
-            <w:pPr>
-              <w:pStyle w:val="Обычный"/>
-            </w:pPr>
-            <w:r>
-              <w:rPr>
-                <w:shd w:val="nil" w:color="auto" w:fill="auto"/>
-                <w:rtl w:val="0"/>
+            <w:tcW w:type="dxa" w:w="1837"/>
+            <w:tcBorders>
+              <w:top w:val="single" w:color="000000" w:sz="4" w:space="0" w:shadow="0" w:frame="0"/>
+              <w:left w:val="single" w:color="000000" w:sz="4" w:space="0" w:shadow="0" w:frame="0"/>
+              <w:bottom w:val="single" w:color="000000" w:sz="4" w:space="0" w:shadow="0" w:frame="0"/>
+              <w:right w:val="single" w:color="000000" w:sz="4" w:space="0" w:shadow="0" w:frame="0"/>
+            </w:tcBorders>
+            <w:shd w:val="clear" w:color="auto" w:fill="auto"/>
+            <w:tcMar>
+              <w:top w:type="dxa" w:w="80"/>
+              <w:left w:type="dxa" w:w="80"/>
+              <w:bottom w:type="dxa" w:w="80"/>
+              <w:right w:type="dxa" w:w="80"/>
+            </w:tcMar>
+            <w:vAlign w:val="top"/>
+          </w:tcPr>
+          <w:p>
+            <w:pPr>
+              <w:pStyle w:val="Обычный"/>
+            </w:pPr>
+            <w:r>
+              <w:rPr>
+                <w:shd w:val="nil" w:color="auto" w:fill="auto"/>
+                <w:rtl w:val="0"/>
+                <w:lang w:val="ru-RU"/>
               </w:rPr>
               <w:t xml:space="preserve">        М</w:t>
             </w:r>
@@ -461,19 +445,21 @@
                 <w:rtl w:val="0"/>
                 <w:lang w:val="ru-RU"/>
               </w:rPr>
-              <w:t>3</w:t>
-            </w:r>
-            <w:r>
-              <w:rPr>
-                <w:shd w:val="nil" w:color="auto" w:fill="auto"/>
-                <w:rtl w:val="0"/>
-              </w:rPr>
-              <w:t xml:space="preserve"> п</w:t>
-            </w:r>
-            <w:r>
-              <w:rPr>
-                <w:shd w:val="nil" w:color="auto" w:fill="auto"/>
-                <w:rtl w:val="0"/>
+              <w:t xml:space="preserve">3 </w:t>
+            </w:r>
+            <w:r>
+              <w:rPr>
+                <w:shd w:val="nil" w:color="auto" w:fill="auto"/>
+                <w:rtl w:val="0"/>
+                <w:lang w:val="ru-RU"/>
+              </w:rPr>
+              <w:t>п</w:t>
+            </w:r>
+            <w:r>
+              <w:rPr>
+                <w:shd w:val="nil" w:color="auto" w:fill="auto"/>
+                <w:rtl w:val="0"/>
+                <w:lang w:val="ru-RU"/>
               </w:rPr>
               <w:t>/</w:t>
             </w:r>
@@ -481,6 +467,7 @@
               <w:rPr>
                 <w:shd w:val="nil" w:color="auto" w:fill="auto"/>
                 <w:rtl w:val="0"/>
+                <w:lang w:val="ru-RU"/>
               </w:rPr>
               <w:t>п</w:t>
             </w:r>
@@ -492,7 +479,7 @@
           <w:shd w:val="clear" w:color="auto" w:fill="ced7e7"/>
         </w:tblPrEx>
         <w:trPr>
-          <w:trHeight w:val="900" w:hRule="atLeast"/>
+          <w:trHeight w:val="910" w:hRule="atLeast"/>
         </w:trPr>
         <w:tc>
           <w:tcPr>
@@ -524,6 +511,7 @@
               <w:rPr>
                 <w:shd w:val="nil" w:color="auto" w:fill="auto"/>
                 <w:rtl w:val="0"/>
+                <w:lang w:val="ru-RU"/>
               </w:rPr>
               <w:t>Командний</w:t>
             </w:r>
@@ -543,6 +531,7 @@
               <w:rPr>
                 <w:shd w:val="nil" w:color="auto" w:fill="auto"/>
                 <w:rtl w:val="0"/>
+                <w:lang w:val="ru-RU"/>
               </w:rPr>
               <w:t>Елімінаційний</w:t>
             </w:r>
@@ -561,6 +550,7 @@
               <w:rPr>
                 <w:shd w:val="nil" w:color="auto" w:fill="auto"/>
                 <w:rtl w:val="0"/>
+                <w:lang w:val="ru-RU"/>
               </w:rPr>
               <w:t xml:space="preserve">Раунд </w:t>
             </w:r>
@@ -568,6 +558,7 @@
               <w:rPr>
                 <w:shd w:val="nil" w:color="auto" w:fill="auto"/>
                 <w:rtl w:val="0"/>
+                <w:lang w:val="ru-RU"/>
               </w:rPr>
               <w:t>2</w:t>
             </w:r>
@@ -575,6 +566,7 @@
               <w:rPr>
                 <w:shd w:val="nil" w:color="auto" w:fill="auto"/>
                 <w:rtl w:val="0"/>
+                <w:lang w:val="ru-RU"/>
               </w:rPr>
               <w:t>х</w:t>
             </w:r>
@@ -582,6 +574,7 @@
               <w:rPr>
                 <w:shd w:val="nil" w:color="auto" w:fill="auto"/>
                 <w:rtl w:val="0"/>
+                <w:lang w:val="ru-RU"/>
               </w:rPr>
               <w:t>50</w:t>
             </w:r>
@@ -589,6 +582,7 @@
               <w:rPr>
                 <w:shd w:val="nil" w:color="auto" w:fill="auto"/>
                 <w:rtl w:val="0"/>
+                <w:lang w:val="ru-RU"/>
               </w:rPr>
               <w:t>м</w:t>
             </w:r>
@@ -624,6 +618,7 @@
               <w:rPr>
                 <w:shd w:val="nil" w:color="auto" w:fill="auto"/>
                 <w:rtl w:val="0"/>
+                <w:lang w:val="ru-RU"/>
               </w:rPr>
               <w:t>Дорошенко Юрій</w:t>
             </w:r>
@@ -642,6 +637,7 @@
               <w:rPr>
                 <w:shd w:val="nil" w:color="auto" w:fill="auto"/>
                 <w:rtl w:val="0"/>
+                <w:lang w:val="ru-RU"/>
               </w:rPr>
               <w:t>Д’якова Вікторія</w:t>
             </w:r>
@@ -671,23 +667,25 @@
               <w:jc w:val="center"/>
               <w:rPr>
                 <w:shd w:val="nil" w:color="auto" w:fill="auto"/>
-              </w:rPr>
-            </w:pPr>
-          </w:p>
-          <w:p>
-            <w:pPr>
-              <w:pStyle w:val="Обычный"/>
-              <w:bidi w:val="0"/>
-              <w:ind w:left="0" w:right="0" w:firstLine="0"/>
-              <w:jc w:val="center"/>
-              <w:rPr>
-                <w:rtl w:val="0"/>
-              </w:rPr>
-            </w:pPr>
-            <w:r>
-              <w:rPr>
-                <w:shd w:val="nil" w:color="auto" w:fill="auto"/>
-                <w:rtl w:val="0"/>
+                <w:lang w:val="ru-RU"/>
+              </w:rPr>
+            </w:pPr>
+          </w:p>
+          <w:p>
+            <w:pPr>
+              <w:pStyle w:val="Обычный"/>
+              <w:bidi w:val="0"/>
+              <w:ind w:left="0" w:right="0" w:firstLine="0"/>
+              <w:jc w:val="center"/>
+              <w:rPr>
+                <w:rtl w:val="0"/>
+              </w:rPr>
+            </w:pPr>
+            <w:r>
+              <w:rPr>
+                <w:shd w:val="nil" w:color="auto" w:fill="auto"/>
+                <w:rtl w:val="0"/>
+                <w:lang w:val="ru-RU"/>
               </w:rPr>
               <w:t>26-29.07.2012</w:t>
             </w:r>
@@ -695,45 +693,47 @@
         </w:tc>
         <w:tc>
           <w:tcPr>
-            <w:tcW w:type="dxa" w:w="3117"/>
-            <w:tcBorders>
-              <w:top w:val="single" w:color="000000" w:sz="4" w:space="0" w:shadow="0" w:frame="0"/>
-              <w:left w:val="single" w:color="000000" w:sz="4" w:space="0" w:shadow="0" w:frame="0"/>
-              <w:bottom w:val="single" w:color="000000" w:sz="4" w:space="0" w:shadow="0" w:frame="0"/>
-              <w:right w:val="single" w:color="000000" w:sz="4" w:space="0" w:shadow="0" w:frame="0"/>
-            </w:tcBorders>
-            <w:shd w:val="clear" w:color="auto" w:fill="auto"/>
-            <w:tcMar>
-              <w:top w:type="dxa" w:w="80"/>
-              <w:left w:type="dxa" w:w="80"/>
-              <w:bottom w:type="dxa" w:w="80"/>
-              <w:right w:type="dxa" w:w="80"/>
-            </w:tcMar>
-            <w:vAlign w:val="top"/>
-          </w:tcPr>
-          <w:p>
-            <w:pPr>
-              <w:pStyle w:val="Обычный"/>
-              <w:jc w:val="center"/>
-              <w:rPr>
-                <w:shd w:val="nil" w:color="auto" w:fill="auto"/>
-              </w:rPr>
-            </w:pPr>
-          </w:p>
-          <w:p>
-            <w:pPr>
-              <w:pStyle w:val="Обычный"/>
-              <w:bidi w:val="0"/>
-              <w:ind w:left="0" w:right="0" w:firstLine="0"/>
-              <w:jc w:val="center"/>
-              <w:rPr>
-                <w:rtl w:val="0"/>
-              </w:rPr>
-            </w:pPr>
-            <w:r>
-              <w:rPr>
-                <w:shd w:val="nil" w:color="auto" w:fill="auto"/>
-                <w:rtl w:val="0"/>
+            <w:tcW w:type="dxa" w:w="3118"/>
+            <w:tcBorders>
+              <w:top w:val="single" w:color="000000" w:sz="4" w:space="0" w:shadow="0" w:frame="0"/>
+              <w:left w:val="single" w:color="000000" w:sz="4" w:space="0" w:shadow="0" w:frame="0"/>
+              <w:bottom w:val="single" w:color="000000" w:sz="4" w:space="0" w:shadow="0" w:frame="0"/>
+              <w:right w:val="single" w:color="000000" w:sz="4" w:space="0" w:shadow="0" w:frame="0"/>
+            </w:tcBorders>
+            <w:shd w:val="clear" w:color="auto" w:fill="auto"/>
+            <w:tcMar>
+              <w:top w:type="dxa" w:w="80"/>
+              <w:left w:type="dxa" w:w="80"/>
+              <w:bottom w:type="dxa" w:w="80"/>
+              <w:right w:type="dxa" w:w="80"/>
+            </w:tcMar>
+            <w:vAlign w:val="top"/>
+          </w:tcPr>
+          <w:p>
+            <w:pPr>
+              <w:pStyle w:val="Обычный"/>
+              <w:jc w:val="center"/>
+              <w:rPr>
+                <w:shd w:val="nil" w:color="auto" w:fill="auto"/>
+                <w:lang w:val="ru-RU"/>
+              </w:rPr>
+            </w:pPr>
+          </w:p>
+          <w:p>
+            <w:pPr>
+              <w:pStyle w:val="Обычный"/>
+              <w:bidi w:val="0"/>
+              <w:ind w:left="0" w:right="0" w:firstLine="0"/>
+              <w:jc w:val="center"/>
+              <w:rPr>
+                <w:rtl w:val="0"/>
+              </w:rPr>
+            </w:pPr>
+            <w:r>
+              <w:rPr>
+                <w:shd w:val="nil" w:color="auto" w:fill="auto"/>
+                <w:rtl w:val="0"/>
+                <w:lang w:val="ru-RU"/>
               </w:rPr>
               <w:t>Львів</w:t>
             </w:r>
@@ -741,6 +741,7 @@
               <w:rPr>
                 <w:shd w:val="nil" w:color="auto" w:fill="auto"/>
                 <w:rtl w:val="0"/>
+                <w:lang w:val="ru-RU"/>
               </w:rPr>
               <w:t xml:space="preserve">, </w:t>
             </w:r>
@@ -748,57 +749,55 @@
               <w:rPr>
                 <w:shd w:val="nil" w:color="auto" w:fill="auto"/>
                 <w:rtl w:val="0"/>
+                <w:lang w:val="ru-RU"/>
               </w:rPr>
               <w:t>Чемпіонат України</w:t>
             </w:r>
-            <w:r>
-              <w:rPr>
-                <w:shd w:val="nil" w:color="auto" w:fill="auto"/>
-              </w:rPr>
-            </w:r>
-          </w:p>
-        </w:tc>
-        <w:tc>
-          <w:tcPr>
-            <w:tcW w:type="dxa" w:w="2552"/>
-            <w:tcBorders>
-              <w:top w:val="single" w:color="000000" w:sz="4" w:space="0" w:shadow="0" w:frame="0"/>
-              <w:left w:val="single" w:color="000000" w:sz="4" w:space="0" w:shadow="0" w:frame="0"/>
-              <w:bottom w:val="single" w:color="000000" w:sz="4" w:space="0" w:shadow="0" w:frame="0"/>
-              <w:right w:val="single" w:color="000000" w:sz="4" w:space="0" w:shadow="0" w:frame="0"/>
-            </w:tcBorders>
-            <w:shd w:val="clear" w:color="auto" w:fill="auto"/>
-            <w:tcMar>
-              <w:top w:type="dxa" w:w="80"/>
-              <w:left w:type="dxa" w:w="80"/>
-              <w:bottom w:type="dxa" w:w="80"/>
-              <w:right w:type="dxa" w:w="80"/>
-            </w:tcMar>
-            <w:vAlign w:val="top"/>
-          </w:tcPr>
-          <w:p>
-            <w:pPr>
-              <w:pStyle w:val="Обычный"/>
-              <w:jc w:val="center"/>
-              <w:rPr>
-                <w:shd w:val="nil" w:color="auto" w:fill="auto"/>
-              </w:rPr>
-            </w:pPr>
-          </w:p>
-          <w:p>
-            <w:pPr>
-              <w:pStyle w:val="Обычный"/>
-              <w:bidi w:val="0"/>
-              <w:ind w:left="0" w:right="0" w:firstLine="0"/>
-              <w:jc w:val="center"/>
-              <w:rPr>
-                <w:rtl w:val="0"/>
-              </w:rPr>
-            </w:pPr>
-            <w:r>
-              <w:rPr>
-                <w:shd w:val="nil" w:color="auto" w:fill="auto"/>
-                <w:rtl w:val="0"/>
+          </w:p>
+        </w:tc>
+        <w:tc>
+          <w:tcPr>
+            <w:tcW w:type="dxa" w:w="2553"/>
+            <w:tcBorders>
+              <w:top w:val="single" w:color="000000" w:sz="4" w:space="0" w:shadow="0" w:frame="0"/>
+              <w:left w:val="single" w:color="000000" w:sz="4" w:space="0" w:shadow="0" w:frame="0"/>
+              <w:bottom w:val="single" w:color="000000" w:sz="4" w:space="0" w:shadow="0" w:frame="0"/>
+              <w:right w:val="single" w:color="000000" w:sz="4" w:space="0" w:shadow="0" w:frame="0"/>
+            </w:tcBorders>
+            <w:shd w:val="clear" w:color="auto" w:fill="auto"/>
+            <w:tcMar>
+              <w:top w:type="dxa" w:w="80"/>
+              <w:left w:type="dxa" w:w="80"/>
+              <w:bottom w:type="dxa" w:w="80"/>
+              <w:right w:type="dxa" w:w="80"/>
+            </w:tcMar>
+            <w:vAlign w:val="top"/>
+          </w:tcPr>
+          <w:p>
+            <w:pPr>
+              <w:pStyle w:val="Обычный"/>
+              <w:jc w:val="center"/>
+              <w:rPr>
+                <w:shd w:val="nil" w:color="auto" w:fill="auto"/>
+                <w:lang w:val="ru-RU"/>
+              </w:rPr>
+            </w:pPr>
+          </w:p>
+          <w:p>
+            <w:pPr>
+              <w:pStyle w:val="Обычный"/>
+              <w:bidi w:val="0"/>
+              <w:ind w:left="0" w:right="0" w:firstLine="0"/>
+              <w:jc w:val="center"/>
+              <w:rPr>
+                <w:rtl w:val="0"/>
+              </w:rPr>
+            </w:pPr>
+            <w:r>
+              <w:rPr>
+                <w:shd w:val="nil" w:color="auto" w:fill="auto"/>
+                <w:rtl w:val="0"/>
+                <w:lang w:val="ru-RU"/>
               </w:rPr>
               <w:t>ЦШВСМ</w:t>
             </w:r>
@@ -806,28 +805,29 @@
         </w:tc>
         <w:tc>
           <w:tcPr>
-            <w:tcW w:type="dxa" w:w="1216"/>
-            <w:tcBorders>
-              <w:top w:val="single" w:color="000000" w:sz="4" w:space="0" w:shadow="0" w:frame="0"/>
-              <w:left w:val="single" w:color="000000" w:sz="4" w:space="0" w:shadow="0" w:frame="0"/>
-              <w:bottom w:val="single" w:color="000000" w:sz="4" w:space="0" w:shadow="0" w:frame="0"/>
-              <w:right w:val="single" w:color="000000" w:sz="4" w:space="0" w:shadow="0" w:frame="0"/>
-            </w:tcBorders>
-            <w:shd w:val="clear" w:color="auto" w:fill="auto"/>
-            <w:tcMar>
-              <w:top w:type="dxa" w:w="80"/>
-              <w:left w:type="dxa" w:w="80"/>
-              <w:bottom w:type="dxa" w:w="80"/>
-              <w:right w:type="dxa" w:w="80"/>
-            </w:tcMar>
-            <w:vAlign w:val="top"/>
-          </w:tcPr>
-          <w:p>
-            <w:pPr>
-              <w:pStyle w:val="Обычный"/>
-              <w:jc w:val="center"/>
-              <w:rPr>
-                <w:shd w:val="nil" w:color="auto" w:fill="auto"/>
+            <w:tcW w:type="dxa" w:w="1215"/>
+            <w:tcBorders>
+              <w:top w:val="single" w:color="000000" w:sz="4" w:space="0" w:shadow="0" w:frame="0"/>
+              <w:left w:val="single" w:color="000000" w:sz="4" w:space="0" w:shadow="0" w:frame="0"/>
+              <w:bottom w:val="single" w:color="000000" w:sz="4" w:space="0" w:shadow="0" w:frame="0"/>
+              <w:right w:val="single" w:color="000000" w:sz="4" w:space="0" w:shadow="0" w:frame="0"/>
+            </w:tcBorders>
+            <w:shd w:val="clear" w:color="auto" w:fill="auto"/>
+            <w:tcMar>
+              <w:top w:type="dxa" w:w="80"/>
+              <w:left w:type="dxa" w:w="80"/>
+              <w:bottom w:type="dxa" w:w="80"/>
+              <w:right w:type="dxa" w:w="80"/>
+            </w:tcMar>
+            <w:vAlign w:val="top"/>
+          </w:tcPr>
+          <w:p>
+            <w:pPr>
+              <w:pStyle w:val="Обычный"/>
+              <w:jc w:val="center"/>
+              <w:rPr>
+                <w:shd w:val="nil" w:color="auto" w:fill="auto"/>
+                <w:lang w:val="ru-RU"/>
               </w:rPr>
             </w:pPr>
           </w:p>
@@ -847,48 +847,43 @@
                 <w:bCs w:val="1"/>
                 <w:shd w:val="nil" w:color="auto" w:fill="auto"/>
                 <w:rtl w:val="0"/>
+                <w:lang w:val="ru-RU"/>
               </w:rPr>
               <w:t>1364</w:t>
             </w:r>
-            <w:r>
-              <w:rPr>
-                <w:b w:val="1"/>
-                <w:bCs w:val="1"/>
-                <w:shd w:val="nil" w:color="auto" w:fill="auto"/>
-              </w:rPr>
-            </w:r>
-          </w:p>
-        </w:tc>
-        <w:tc>
-          <w:tcPr>
-            <w:tcW w:type="dxa" w:w="1836"/>
-            <w:tcBorders>
-              <w:top w:val="single" w:color="000000" w:sz="4" w:space="0" w:shadow="0" w:frame="0"/>
-              <w:left w:val="single" w:color="000000" w:sz="4" w:space="0" w:shadow="0" w:frame="0"/>
-              <w:bottom w:val="single" w:color="000000" w:sz="4" w:space="0" w:shadow="0" w:frame="0"/>
-              <w:right w:val="single" w:color="000000" w:sz="4" w:space="0" w:shadow="0" w:frame="0"/>
-            </w:tcBorders>
-            <w:shd w:val="clear" w:color="auto" w:fill="auto"/>
-            <w:tcMar>
-              <w:top w:type="dxa" w:w="80"/>
-              <w:left w:type="dxa" w:w="80"/>
-              <w:bottom w:type="dxa" w:w="80"/>
-              <w:right w:type="dxa" w:w="80"/>
-            </w:tcMar>
-            <w:vAlign w:val="top"/>
-          </w:tcPr>
-          <w:p>
-            <w:pPr>
-              <w:pStyle w:val="Обычный"/>
-              <w:jc w:val="center"/>
-              <w:rPr>
-                <w:shd w:val="nil" w:color="auto" w:fill="auto"/>
-              </w:rPr>
-            </w:pPr>
-            <w:r>
-              <w:rPr>
-                <w:shd w:val="nil" w:color="auto" w:fill="auto"/>
-                <w:rtl w:val="0"/>
+          </w:p>
+        </w:tc>
+        <w:tc>
+          <w:tcPr>
+            <w:tcW w:type="dxa" w:w="1837"/>
+            <w:tcBorders>
+              <w:top w:val="single" w:color="000000" w:sz="4" w:space="0" w:shadow="0" w:frame="0"/>
+              <w:left w:val="single" w:color="000000" w:sz="4" w:space="0" w:shadow="0" w:frame="0"/>
+              <w:bottom w:val="single" w:color="000000" w:sz="4" w:space="0" w:shadow="0" w:frame="0"/>
+              <w:right w:val="single" w:color="000000" w:sz="4" w:space="0" w:shadow="0" w:frame="0"/>
+            </w:tcBorders>
+            <w:shd w:val="clear" w:color="auto" w:fill="auto"/>
+            <w:tcMar>
+              <w:top w:type="dxa" w:w="80"/>
+              <w:left w:type="dxa" w:w="80"/>
+              <w:bottom w:type="dxa" w:w="80"/>
+              <w:right w:type="dxa" w:w="80"/>
+            </w:tcMar>
+            <w:vAlign w:val="top"/>
+          </w:tcPr>
+          <w:p>
+            <w:pPr>
+              <w:pStyle w:val="Обычный"/>
+              <w:jc w:val="center"/>
+              <w:rPr>
+                <w:shd w:val="nil" w:color="auto" w:fill="auto"/>
+              </w:rPr>
+            </w:pPr>
+            <w:r>
+              <w:rPr>
+                <w:shd w:val="nil" w:color="auto" w:fill="auto"/>
+                <w:rtl w:val="0"/>
+                <w:lang w:val="ru-RU"/>
               </w:rPr>
               <w:t>337,339</w:t>
             </w:r>
@@ -907,6 +902,7 @@
               <w:rPr>
                 <w:shd w:val="nil" w:color="auto" w:fill="auto"/>
                 <w:rtl w:val="0"/>
+                <w:lang w:val="ru-RU"/>
               </w:rPr>
               <w:t>347,341</w:t>
             </w:r>
@@ -918,7 +914,7 @@
           <w:shd w:val="clear" w:color="auto" w:fill="ced7e7"/>
         </w:tblPrEx>
         <w:trPr>
-          <w:trHeight w:val="900" w:hRule="atLeast"/>
+          <w:trHeight w:val="910" w:hRule="atLeast"/>
         </w:trPr>
         <w:tc>
           <w:tcPr>
@@ -970,16 +966,9 @@
               <w:rPr>
                 <w:shd w:val="nil" w:color="auto" w:fill="auto"/>
                 <w:rtl w:val="0"/>
-              </w:rPr>
-              <w:t>е</w:t>
-            </w:r>
-            <w:r>
-              <w:rPr>
-                <w:shd w:val="nil" w:color="auto" w:fill="auto"/>
-                <w:rtl w:val="0"/>
-                <w:lang w:val="ru-RU"/>
-              </w:rPr>
-              <w:t>л</w:t>
+                <w:lang w:val="ru-RU"/>
+              </w:rPr>
+              <w:t>ел</w:t>
             </w:r>
             <w:r>
               <w:rPr>
@@ -1052,28 +1041,15 @@
               <w:rPr>
                 <w:shd w:val="nil" w:color="auto" w:fill="auto"/>
                 <w:rtl w:val="0"/>
-              </w:rPr>
-              <w:t>р</w:t>
-            </w:r>
-            <w:r>
-              <w:rPr>
-                <w:shd w:val="nil" w:color="auto" w:fill="auto"/>
-                <w:rtl w:val="0"/>
-                <w:lang w:val="ru-RU"/>
-              </w:rPr>
-              <w:t xml:space="preserve">аунд </w:t>
-            </w:r>
-            <w:r>
-              <w:rPr>
-                <w:shd w:val="nil" w:color="auto" w:fill="auto"/>
-                <w:rtl w:val="0"/>
-              </w:rPr>
-              <w:t>М</w:t>
-            </w:r>
-            <w:r>
-              <w:rPr>
-                <w:shd w:val="nil" w:color="auto" w:fill="auto"/>
-                <w:rtl w:val="0"/>
+                <w:lang w:val="ru-RU"/>
+              </w:rPr>
+              <w:t>раунд М</w:t>
+            </w:r>
+            <w:r>
+              <w:rPr>
+                <w:shd w:val="nil" w:color="auto" w:fill="auto"/>
+                <w:rtl w:val="0"/>
+                <w:lang w:val="ru-RU"/>
               </w:rPr>
               <w:t>-1</w:t>
             </w:r>
@@ -1109,6 +1085,7 @@
               <w:rPr>
                 <w:shd w:val="nil" w:color="auto" w:fill="auto"/>
                 <w:rtl w:val="0"/>
+                <w:lang w:val="ru-RU"/>
               </w:rPr>
               <w:t>Д’якова Вікторія</w:t>
             </w:r>
@@ -1127,6 +1104,7 @@
               <w:rPr>
                 <w:shd w:val="nil" w:color="auto" w:fill="auto"/>
                 <w:rtl w:val="0"/>
+                <w:lang w:val="ru-RU"/>
               </w:rPr>
               <w:t>Головко Вадим</w:t>
             </w:r>
@@ -1156,23 +1134,25 @@
               <w:jc w:val="center"/>
               <w:rPr>
                 <w:shd w:val="nil" w:color="auto" w:fill="auto"/>
-              </w:rPr>
-            </w:pPr>
-          </w:p>
-          <w:p>
-            <w:pPr>
-              <w:pStyle w:val="Обычный"/>
-              <w:bidi w:val="0"/>
-              <w:ind w:left="0" w:right="0" w:firstLine="0"/>
-              <w:jc w:val="center"/>
-              <w:rPr>
-                <w:rtl w:val="0"/>
-              </w:rPr>
-            </w:pPr>
-            <w:r>
-              <w:rPr>
-                <w:shd w:val="nil" w:color="auto" w:fill="auto"/>
-                <w:rtl w:val="0"/>
+                <w:lang w:val="ru-RU"/>
+              </w:rPr>
+            </w:pPr>
+          </w:p>
+          <w:p>
+            <w:pPr>
+              <w:pStyle w:val="Обычный"/>
+              <w:bidi w:val="0"/>
+              <w:ind w:left="0" w:right="0" w:firstLine="0"/>
+              <w:jc w:val="center"/>
+              <w:rPr>
+                <w:rtl w:val="0"/>
+              </w:rPr>
+            </w:pPr>
+            <w:r>
+              <w:rPr>
+                <w:shd w:val="nil" w:color="auto" w:fill="auto"/>
+                <w:rtl w:val="0"/>
+                <w:lang w:val="ru-RU"/>
               </w:rPr>
               <w:t>09-15.09.2012</w:t>
             </w:r>
@@ -1180,45 +1160,47 @@
         </w:tc>
         <w:tc>
           <w:tcPr>
-            <w:tcW w:type="dxa" w:w="3117"/>
-            <w:tcBorders>
-              <w:top w:val="single" w:color="000000" w:sz="4" w:space="0" w:shadow="0" w:frame="0"/>
-              <w:left w:val="single" w:color="000000" w:sz="4" w:space="0" w:shadow="0" w:frame="0"/>
-              <w:bottom w:val="single" w:color="000000" w:sz="4" w:space="0" w:shadow="0" w:frame="0"/>
-              <w:right w:val="single" w:color="000000" w:sz="4" w:space="0" w:shadow="0" w:frame="0"/>
-            </w:tcBorders>
-            <w:shd w:val="clear" w:color="auto" w:fill="auto"/>
-            <w:tcMar>
-              <w:top w:type="dxa" w:w="80"/>
-              <w:left w:type="dxa" w:w="80"/>
-              <w:bottom w:type="dxa" w:w="80"/>
-              <w:right w:type="dxa" w:w="80"/>
-            </w:tcMar>
-            <w:vAlign w:val="top"/>
-          </w:tcPr>
-          <w:p>
-            <w:pPr>
-              <w:pStyle w:val="Обычный"/>
-              <w:jc w:val="center"/>
-              <w:rPr>
-                <w:shd w:val="nil" w:color="auto" w:fill="auto"/>
-              </w:rPr>
-            </w:pPr>
-          </w:p>
-          <w:p>
-            <w:pPr>
-              <w:pStyle w:val="Обычный"/>
-              <w:bidi w:val="0"/>
-              <w:ind w:left="0" w:right="0" w:firstLine="0"/>
-              <w:jc w:val="center"/>
-              <w:rPr>
-                <w:rtl w:val="0"/>
-              </w:rPr>
-            </w:pPr>
-            <w:r>
-              <w:rPr>
-                <w:shd w:val="nil" w:color="auto" w:fill="auto"/>
-                <w:rtl w:val="0"/>
+            <w:tcW w:type="dxa" w:w="3118"/>
+            <w:tcBorders>
+              <w:top w:val="single" w:color="000000" w:sz="4" w:space="0" w:shadow="0" w:frame="0"/>
+              <w:left w:val="single" w:color="000000" w:sz="4" w:space="0" w:shadow="0" w:frame="0"/>
+              <w:bottom w:val="single" w:color="000000" w:sz="4" w:space="0" w:shadow="0" w:frame="0"/>
+              <w:right w:val="single" w:color="000000" w:sz="4" w:space="0" w:shadow="0" w:frame="0"/>
+            </w:tcBorders>
+            <w:shd w:val="clear" w:color="auto" w:fill="auto"/>
+            <w:tcMar>
+              <w:top w:type="dxa" w:w="80"/>
+              <w:left w:type="dxa" w:w="80"/>
+              <w:bottom w:type="dxa" w:w="80"/>
+              <w:right w:type="dxa" w:w="80"/>
+            </w:tcMar>
+            <w:vAlign w:val="top"/>
+          </w:tcPr>
+          <w:p>
+            <w:pPr>
+              <w:pStyle w:val="Обычный"/>
+              <w:jc w:val="center"/>
+              <w:rPr>
+                <w:shd w:val="nil" w:color="auto" w:fill="auto"/>
+                <w:lang w:val="ru-RU"/>
+              </w:rPr>
+            </w:pPr>
+          </w:p>
+          <w:p>
+            <w:pPr>
+              <w:pStyle w:val="Обычный"/>
+              <w:bidi w:val="0"/>
+              <w:ind w:left="0" w:right="0" w:firstLine="0"/>
+              <w:jc w:val="center"/>
+              <w:rPr>
+                <w:rtl w:val="0"/>
+              </w:rPr>
+            </w:pPr>
+            <w:r>
+              <w:rPr>
+                <w:shd w:val="nil" w:color="auto" w:fill="auto"/>
+                <w:rtl w:val="0"/>
+                <w:lang w:val="ru-RU"/>
               </w:rPr>
               <w:t>Львів</w:t>
             </w:r>
@@ -1226,6 +1208,7 @@
               <w:rPr>
                 <w:shd w:val="nil" w:color="auto" w:fill="auto"/>
                 <w:rtl w:val="0"/>
+                <w:lang w:val="ru-RU"/>
               </w:rPr>
               <w:t xml:space="preserve">, </w:t>
             </w:r>
@@ -1233,6 +1216,7 @@
               <w:rPr>
                 <w:shd w:val="nil" w:color="auto" w:fill="auto"/>
                 <w:rtl w:val="0"/>
+                <w:lang w:val="ru-RU"/>
               </w:rPr>
               <w:t>«Золота осінь»</w:t>
             </w:r>
@@ -1240,45 +1224,47 @@
         </w:tc>
         <w:tc>
           <w:tcPr>
-            <w:tcW w:type="dxa" w:w="2552"/>
-            <w:tcBorders>
-              <w:top w:val="single" w:color="000000" w:sz="4" w:space="0" w:shadow="0" w:frame="0"/>
-              <w:left w:val="single" w:color="000000" w:sz="4" w:space="0" w:shadow="0" w:frame="0"/>
-              <w:bottom w:val="single" w:color="000000" w:sz="4" w:space="0" w:shadow="0" w:frame="0"/>
-              <w:right w:val="single" w:color="000000" w:sz="4" w:space="0" w:shadow="0" w:frame="0"/>
-            </w:tcBorders>
-            <w:shd w:val="clear" w:color="auto" w:fill="auto"/>
-            <w:tcMar>
-              <w:top w:type="dxa" w:w="80"/>
-              <w:left w:type="dxa" w:w="80"/>
-              <w:bottom w:type="dxa" w:w="80"/>
-              <w:right w:type="dxa" w:w="80"/>
-            </w:tcMar>
-            <w:vAlign w:val="top"/>
-          </w:tcPr>
-          <w:p>
-            <w:pPr>
-              <w:pStyle w:val="Обычный"/>
-              <w:jc w:val="center"/>
-              <w:rPr>
-                <w:shd w:val="nil" w:color="auto" w:fill="auto"/>
-              </w:rPr>
-            </w:pPr>
-          </w:p>
-          <w:p>
-            <w:pPr>
-              <w:pStyle w:val="Обычный"/>
-              <w:bidi w:val="0"/>
-              <w:ind w:left="0" w:right="0" w:firstLine="0"/>
-              <w:jc w:val="center"/>
-              <w:rPr>
-                <w:rtl w:val="0"/>
-              </w:rPr>
-            </w:pPr>
-            <w:r>
-              <w:rPr>
-                <w:shd w:val="nil" w:color="auto" w:fill="auto"/>
-                <w:rtl w:val="0"/>
+            <w:tcW w:type="dxa" w:w="2553"/>
+            <w:tcBorders>
+              <w:top w:val="single" w:color="000000" w:sz="4" w:space="0" w:shadow="0" w:frame="0"/>
+              <w:left w:val="single" w:color="000000" w:sz="4" w:space="0" w:shadow="0" w:frame="0"/>
+              <w:bottom w:val="single" w:color="000000" w:sz="4" w:space="0" w:shadow="0" w:frame="0"/>
+              <w:right w:val="single" w:color="000000" w:sz="4" w:space="0" w:shadow="0" w:frame="0"/>
+            </w:tcBorders>
+            <w:shd w:val="clear" w:color="auto" w:fill="auto"/>
+            <w:tcMar>
+              <w:top w:type="dxa" w:w="80"/>
+              <w:left w:type="dxa" w:w="80"/>
+              <w:bottom w:type="dxa" w:w="80"/>
+              <w:right w:type="dxa" w:w="80"/>
+            </w:tcMar>
+            <w:vAlign w:val="top"/>
+          </w:tcPr>
+          <w:p>
+            <w:pPr>
+              <w:pStyle w:val="Обычный"/>
+              <w:jc w:val="center"/>
+              <w:rPr>
+                <w:shd w:val="nil" w:color="auto" w:fill="auto"/>
+                <w:lang w:val="ru-RU"/>
+              </w:rPr>
+            </w:pPr>
+          </w:p>
+          <w:p>
+            <w:pPr>
+              <w:pStyle w:val="Обычный"/>
+              <w:bidi w:val="0"/>
+              <w:ind w:left="0" w:right="0" w:firstLine="0"/>
+              <w:jc w:val="center"/>
+              <w:rPr>
+                <w:rtl w:val="0"/>
+              </w:rPr>
+            </w:pPr>
+            <w:r>
+              <w:rPr>
+                <w:shd w:val="nil" w:color="auto" w:fill="auto"/>
+                <w:rtl w:val="0"/>
+                <w:lang w:val="ru-RU"/>
               </w:rPr>
               <w:t>Харківська</w:t>
             </w:r>
@@ -1286,7 +1272,7 @@
         </w:tc>
         <w:tc>
           <w:tcPr>
-            <w:tcW w:type="dxa" w:w="1216"/>
+            <w:tcW w:type="dxa" w:w="1215"/>
             <w:tcBorders>
               <w:top w:val="single" w:color="000000" w:sz="4" w:space="0" w:shadow="0" w:frame="0"/>
               <w:left w:val="single" w:color="000000" w:sz="4" w:space="0" w:shadow="0" w:frame="0"/>
@@ -1310,6 +1296,7 @@
                 <w:b w:val="1"/>
                 <w:bCs w:val="1"/>
                 <w:shd w:val="nil" w:color="auto" w:fill="auto"/>
+                <w:lang w:val="ru-RU"/>
               </w:rPr>
             </w:pPr>
           </w:p>
@@ -1329,6 +1316,7 @@
                 <w:bCs w:val="1"/>
                 <w:shd w:val="nil" w:color="auto" w:fill="auto"/>
                 <w:rtl w:val="0"/>
+                <w:lang w:val="ru-RU"/>
               </w:rPr>
               <w:t>2723</w:t>
             </w:r>
@@ -1336,34 +1324,35 @@
         </w:tc>
         <w:tc>
           <w:tcPr>
-            <w:tcW w:type="dxa" w:w="1836"/>
-            <w:tcBorders>
-              <w:top w:val="single" w:color="000000" w:sz="4" w:space="0" w:shadow="0" w:frame="0"/>
-              <w:left w:val="single" w:color="000000" w:sz="4" w:space="0" w:shadow="0" w:frame="0"/>
-              <w:bottom w:val="single" w:color="000000" w:sz="4" w:space="0" w:shadow="0" w:frame="0"/>
-              <w:right w:val="single" w:color="000000" w:sz="4" w:space="0" w:shadow="0" w:frame="0"/>
-            </w:tcBorders>
-            <w:shd w:val="clear" w:color="auto" w:fill="auto"/>
-            <w:tcMar>
-              <w:top w:type="dxa" w:w="80"/>
-              <w:left w:type="dxa" w:w="80"/>
-              <w:bottom w:type="dxa" w:w="80"/>
-              <w:right w:type="dxa" w:w="80"/>
-            </w:tcMar>
-            <w:vAlign w:val="top"/>
-          </w:tcPr>
-          <w:p>
-            <w:pPr>
-              <w:pStyle w:val="Обычный"/>
-              <w:jc w:val="center"/>
-              <w:rPr>
-                <w:shd w:val="nil" w:color="auto" w:fill="auto"/>
-              </w:rPr>
-            </w:pPr>
-            <w:r>
-              <w:rPr>
-                <w:shd w:val="nil" w:color="auto" w:fill="auto"/>
-                <w:rtl w:val="0"/>
+            <w:tcW w:type="dxa" w:w="1837"/>
+            <w:tcBorders>
+              <w:top w:val="single" w:color="000000" w:sz="4" w:space="0" w:shadow="0" w:frame="0"/>
+              <w:left w:val="single" w:color="000000" w:sz="4" w:space="0" w:shadow="0" w:frame="0"/>
+              <w:bottom w:val="single" w:color="000000" w:sz="4" w:space="0" w:shadow="0" w:frame="0"/>
+              <w:right w:val="single" w:color="000000" w:sz="4" w:space="0" w:shadow="0" w:frame="0"/>
+            </w:tcBorders>
+            <w:shd w:val="clear" w:color="auto" w:fill="auto"/>
+            <w:tcMar>
+              <w:top w:type="dxa" w:w="80"/>
+              <w:left w:type="dxa" w:w="80"/>
+              <w:bottom w:type="dxa" w:w="80"/>
+              <w:right w:type="dxa" w:w="80"/>
+            </w:tcMar>
+            <w:vAlign w:val="top"/>
+          </w:tcPr>
+          <w:p>
+            <w:pPr>
+              <w:pStyle w:val="Обычный"/>
+              <w:jc w:val="center"/>
+              <w:rPr>
+                <w:shd w:val="nil" w:color="auto" w:fill="auto"/>
+              </w:rPr>
+            </w:pPr>
+            <w:r>
+              <w:rPr>
+                <w:shd w:val="nil" w:color="auto" w:fill="auto"/>
+                <w:rtl w:val="0"/>
+                <w:lang w:val="ru-RU"/>
               </w:rPr>
               <w:t>337,348,335,354</w:t>
             </w:r>
@@ -1382,6 +1371,7 @@
               <w:rPr>
                 <w:shd w:val="nil" w:color="auto" w:fill="auto"/>
                 <w:rtl w:val="0"/>
+                <w:lang w:val="ru-RU"/>
               </w:rPr>
               <w:t>328,333,340,348</w:t>
             </w:r>
@@ -1393,7 +1383,7 @@
           <w:shd w:val="clear" w:color="auto" w:fill="ced7e7"/>
         </w:tblPrEx>
         <w:trPr>
-          <w:trHeight w:val="900" w:hRule="atLeast"/>
+          <w:trHeight w:val="910" w:hRule="atLeast"/>
         </w:trPr>
         <w:tc>
           <w:tcPr>
@@ -1425,6 +1415,7 @@
               <w:rPr>
                 <w:shd w:val="nil" w:color="auto" w:fill="auto"/>
                 <w:rtl w:val="0"/>
+                <w:lang w:val="ru-RU"/>
               </w:rPr>
               <w:t xml:space="preserve">Фінали </w:t>
             </w:r>
@@ -1432,6 +1423,7 @@
               <w:rPr>
                 <w:shd w:val="nil" w:color="auto" w:fill="auto"/>
                 <w:rtl w:val="0"/>
+                <w:lang w:val="ru-RU"/>
               </w:rPr>
               <w:t>50</w:t>
             </w:r>
@@ -1439,6 +1431,7 @@
               <w:rPr>
                 <w:shd w:val="nil" w:color="auto" w:fill="auto"/>
                 <w:rtl w:val="0"/>
+                <w:lang w:val="ru-RU"/>
               </w:rPr>
               <w:t>м</w:t>
             </w:r>
@@ -1457,6 +1450,7 @@
               <w:rPr>
                 <w:shd w:val="nil" w:color="auto" w:fill="auto"/>
                 <w:rtl w:val="0"/>
+                <w:lang w:val="ru-RU"/>
               </w:rPr>
               <w:t xml:space="preserve">16 </w:t>
             </w:r>
@@ -1464,6 +1458,7 @@
               <w:rPr>
                 <w:shd w:val="nil" w:color="auto" w:fill="auto"/>
                 <w:rtl w:val="0"/>
+                <w:lang w:val="ru-RU"/>
               </w:rPr>
               <w:t>стр</w:t>
             </w:r>
@@ -1471,6 +1466,7 @@
               <w:rPr>
                 <w:shd w:val="nil" w:color="auto" w:fill="auto"/>
                 <w:rtl w:val="0"/>
+                <w:lang w:val="ru-RU"/>
               </w:rPr>
               <w:t>.</w:t>
             </w:r>
@@ -1506,6 +1502,7 @@
               <w:rPr>
                 <w:shd w:val="nil" w:color="auto" w:fill="auto"/>
                 <w:rtl w:val="0"/>
+                <w:lang w:val="ru-RU"/>
               </w:rPr>
               <w:t>Борисенко Олена</w:t>
             </w:r>
@@ -1524,14 +1521,10 @@
               <w:rPr>
                 <w:shd w:val="nil" w:color="auto" w:fill="auto"/>
                 <w:rtl w:val="0"/>
+                <w:lang w:val="ru-RU"/>
               </w:rPr>
               <w:t>Головко Вадим</w:t>
             </w:r>
-            <w:r>
-              <w:rPr>
-                <w:shd w:val="nil" w:color="auto" w:fill="auto"/>
-              </w:rPr>
-            </w:r>
           </w:p>
         </w:tc>
         <w:tc>
@@ -1558,23 +1551,25 @@
               <w:jc w:val="center"/>
               <w:rPr>
                 <w:shd w:val="nil" w:color="auto" w:fill="auto"/>
-              </w:rPr>
-            </w:pPr>
-          </w:p>
-          <w:p>
-            <w:pPr>
-              <w:pStyle w:val="Обычный"/>
-              <w:bidi w:val="0"/>
-              <w:ind w:left="0" w:right="0" w:firstLine="0"/>
-              <w:jc w:val="center"/>
-              <w:rPr>
-                <w:rtl w:val="0"/>
-              </w:rPr>
-            </w:pPr>
-            <w:r>
-              <w:rPr>
-                <w:shd w:val="nil" w:color="auto" w:fill="auto"/>
-                <w:rtl w:val="0"/>
+                <w:lang w:val="ru-RU"/>
+              </w:rPr>
+            </w:pPr>
+          </w:p>
+          <w:p>
+            <w:pPr>
+              <w:pStyle w:val="Обычный"/>
+              <w:bidi w:val="0"/>
+              <w:ind w:left="0" w:right="0" w:firstLine="0"/>
+              <w:jc w:val="center"/>
+              <w:rPr>
+                <w:rtl w:val="0"/>
+              </w:rPr>
+            </w:pPr>
+            <w:r>
+              <w:rPr>
+                <w:shd w:val="nil" w:color="auto" w:fill="auto"/>
+                <w:rtl w:val="0"/>
+                <w:lang w:val="ru-RU"/>
               </w:rPr>
               <w:t>07-09.04.2017</w:t>
             </w:r>
@@ -1582,34 +1577,35 @@
         </w:tc>
         <w:tc>
           <w:tcPr>
-            <w:tcW w:type="dxa" w:w="3117"/>
-            <w:tcBorders>
-              <w:top w:val="single" w:color="000000" w:sz="4" w:space="0" w:shadow="0" w:frame="0"/>
-              <w:left w:val="single" w:color="000000" w:sz="4" w:space="0" w:shadow="0" w:frame="0"/>
-              <w:bottom w:val="single" w:color="000000" w:sz="4" w:space="0" w:shadow="0" w:frame="0"/>
-              <w:right w:val="single" w:color="000000" w:sz="4" w:space="0" w:shadow="0" w:frame="0"/>
-            </w:tcBorders>
-            <w:shd w:val="clear" w:color="auto" w:fill="auto"/>
-            <w:tcMar>
-              <w:top w:type="dxa" w:w="80"/>
-              <w:left w:type="dxa" w:w="80"/>
-              <w:bottom w:type="dxa" w:w="80"/>
-              <w:right w:type="dxa" w:w="80"/>
-            </w:tcMar>
-            <w:vAlign w:val="top"/>
-          </w:tcPr>
-          <w:p>
-            <w:pPr>
-              <w:pStyle w:val="Обычный"/>
-              <w:jc w:val="center"/>
-              <w:rPr>
-                <w:shd w:val="nil" w:color="auto" w:fill="auto"/>
-              </w:rPr>
-            </w:pPr>
-            <w:r>
-              <w:rPr>
-                <w:shd w:val="nil" w:color="auto" w:fill="auto"/>
-                <w:rtl w:val="0"/>
+            <w:tcW w:type="dxa" w:w="3118"/>
+            <w:tcBorders>
+              <w:top w:val="single" w:color="000000" w:sz="4" w:space="0" w:shadow="0" w:frame="0"/>
+              <w:left w:val="single" w:color="000000" w:sz="4" w:space="0" w:shadow="0" w:frame="0"/>
+              <w:bottom w:val="single" w:color="000000" w:sz="4" w:space="0" w:shadow="0" w:frame="0"/>
+              <w:right w:val="single" w:color="000000" w:sz="4" w:space="0" w:shadow="0" w:frame="0"/>
+            </w:tcBorders>
+            <w:shd w:val="clear" w:color="auto" w:fill="auto"/>
+            <w:tcMar>
+              <w:top w:type="dxa" w:w="80"/>
+              <w:left w:type="dxa" w:w="80"/>
+              <w:bottom w:type="dxa" w:w="80"/>
+              <w:right w:type="dxa" w:w="80"/>
+            </w:tcMar>
+            <w:vAlign w:val="top"/>
+          </w:tcPr>
+          <w:p>
+            <w:pPr>
+              <w:pStyle w:val="Обычный"/>
+              <w:jc w:val="center"/>
+              <w:rPr>
+                <w:shd w:val="nil" w:color="auto" w:fill="auto"/>
+              </w:rPr>
+            </w:pPr>
+            <w:r>
+              <w:rPr>
+                <w:shd w:val="nil" w:color="auto" w:fill="auto"/>
+                <w:rtl w:val="0"/>
+                <w:lang w:val="ru-RU"/>
               </w:rPr>
               <w:t>Нова Каховка</w:t>
             </w:r>
@@ -1617,6 +1613,7 @@
               <w:rPr>
                 <w:shd w:val="nil" w:color="auto" w:fill="auto"/>
                 <w:rtl w:val="0"/>
+                <w:lang w:val="ru-RU"/>
               </w:rPr>
               <w:t>,</w:t>
             </w:r>
@@ -1636,6 +1633,7 @@
               <w:rPr>
                 <w:shd w:val="nil" w:color="auto" w:fill="auto"/>
                 <w:rtl w:val="0"/>
+                <w:lang w:val="ru-RU"/>
               </w:rPr>
               <w:t>Чемп</w:t>
             </w:r>
@@ -1643,6 +1641,7 @@
               <w:rPr>
                 <w:shd w:val="nil" w:color="auto" w:fill="auto"/>
                 <w:rtl w:val="0"/>
+                <w:lang w:val="ru-RU"/>
               </w:rPr>
               <w:t>.</w:t>
             </w:r>
@@ -1650,6 +1649,7 @@
               <w:rPr>
                 <w:shd w:val="nil" w:color="auto" w:fill="auto"/>
                 <w:rtl w:val="0"/>
+                <w:lang w:val="ru-RU"/>
               </w:rPr>
               <w:t>України серед</w:t>
             </w:r>
@@ -1668,6 +1668,7 @@
               <w:rPr>
                 <w:shd w:val="nil" w:color="auto" w:fill="auto"/>
                 <w:rtl w:val="0"/>
+                <w:lang w:val="ru-RU"/>
               </w:rPr>
               <w:t>шкіл</w:t>
             </w:r>
@@ -1675,6 +1676,7 @@
               <w:rPr>
                 <w:shd w:val="nil" w:color="auto" w:fill="auto"/>
                 <w:rtl w:val="0"/>
+                <w:lang w:val="ru-RU"/>
               </w:rPr>
               <w:t xml:space="preserve">, </w:t>
             </w:r>
@@ -1682,6 +1684,7 @@
               <w:rPr>
                 <w:shd w:val="nil" w:color="auto" w:fill="auto"/>
                 <w:rtl w:val="0"/>
+                <w:lang w:val="ru-RU"/>
               </w:rPr>
               <w:t>клубів</w:t>
             </w:r>
@@ -1689,45 +1692,47 @@
         </w:tc>
         <w:tc>
           <w:tcPr>
-            <w:tcW w:type="dxa" w:w="2552"/>
-            <w:tcBorders>
-              <w:top w:val="single" w:color="000000" w:sz="4" w:space="0" w:shadow="0" w:frame="0"/>
-              <w:left w:val="single" w:color="000000" w:sz="4" w:space="0" w:shadow="0" w:frame="0"/>
-              <w:bottom w:val="single" w:color="000000" w:sz="4" w:space="0" w:shadow="0" w:frame="0"/>
-              <w:right w:val="single" w:color="000000" w:sz="4" w:space="0" w:shadow="0" w:frame="0"/>
-            </w:tcBorders>
-            <w:shd w:val="clear" w:color="auto" w:fill="auto"/>
-            <w:tcMar>
-              <w:top w:type="dxa" w:w="80"/>
-              <w:left w:type="dxa" w:w="80"/>
-              <w:bottom w:type="dxa" w:w="80"/>
-              <w:right w:type="dxa" w:w="80"/>
-            </w:tcMar>
-            <w:vAlign w:val="top"/>
-          </w:tcPr>
-          <w:p>
-            <w:pPr>
-              <w:pStyle w:val="Обычный"/>
-              <w:jc w:val="center"/>
-              <w:rPr>
-                <w:shd w:val="nil" w:color="auto" w:fill="auto"/>
-              </w:rPr>
-            </w:pPr>
-          </w:p>
-          <w:p>
-            <w:pPr>
-              <w:pStyle w:val="Обычный"/>
-              <w:bidi w:val="0"/>
-              <w:ind w:left="0" w:right="0" w:firstLine="0"/>
-              <w:jc w:val="center"/>
-              <w:rPr>
-                <w:rtl w:val="0"/>
-              </w:rPr>
-            </w:pPr>
-            <w:r>
-              <w:rPr>
-                <w:shd w:val="nil" w:color="auto" w:fill="auto"/>
-                <w:rtl w:val="0"/>
+            <w:tcW w:type="dxa" w:w="2553"/>
+            <w:tcBorders>
+              <w:top w:val="single" w:color="000000" w:sz="4" w:space="0" w:shadow="0" w:frame="0"/>
+              <w:left w:val="single" w:color="000000" w:sz="4" w:space="0" w:shadow="0" w:frame="0"/>
+              <w:bottom w:val="single" w:color="000000" w:sz="4" w:space="0" w:shadow="0" w:frame="0"/>
+              <w:right w:val="single" w:color="000000" w:sz="4" w:space="0" w:shadow="0" w:frame="0"/>
+            </w:tcBorders>
+            <w:shd w:val="clear" w:color="auto" w:fill="auto"/>
+            <w:tcMar>
+              <w:top w:type="dxa" w:w="80"/>
+              <w:left w:type="dxa" w:w="80"/>
+              <w:bottom w:type="dxa" w:w="80"/>
+              <w:right w:type="dxa" w:w="80"/>
+            </w:tcMar>
+            <w:vAlign w:val="top"/>
+          </w:tcPr>
+          <w:p>
+            <w:pPr>
+              <w:pStyle w:val="Обычный"/>
+              <w:jc w:val="center"/>
+              <w:rPr>
+                <w:shd w:val="nil" w:color="auto" w:fill="auto"/>
+                <w:lang w:val="ru-RU"/>
+              </w:rPr>
+            </w:pPr>
+          </w:p>
+          <w:p>
+            <w:pPr>
+              <w:pStyle w:val="Обычный"/>
+              <w:bidi w:val="0"/>
+              <w:ind w:left="0" w:right="0" w:firstLine="0"/>
+              <w:jc w:val="center"/>
+              <w:rPr>
+                <w:rtl w:val="0"/>
+              </w:rPr>
+            </w:pPr>
+            <w:r>
+              <w:rPr>
+                <w:shd w:val="nil" w:color="auto" w:fill="auto"/>
+                <w:rtl w:val="0"/>
+                <w:lang w:val="ru-RU"/>
               </w:rPr>
               <w:t>ХНУ ім</w:t>
             </w:r>
@@ -1735,6 +1740,7 @@
               <w:rPr>
                 <w:shd w:val="nil" w:color="auto" w:fill="auto"/>
                 <w:rtl w:val="0"/>
+                <w:lang w:val="ru-RU"/>
               </w:rPr>
               <w:t>.</w:t>
             </w:r>
@@ -1742,6 +1748,7 @@
               <w:rPr>
                 <w:shd w:val="nil" w:color="auto" w:fill="auto"/>
                 <w:rtl w:val="0"/>
+                <w:lang w:val="ru-RU"/>
               </w:rPr>
               <w:t>В</w:t>
             </w:r>
@@ -1749,6 +1756,7 @@
               <w:rPr>
                 <w:shd w:val="nil" w:color="auto" w:fill="auto"/>
                 <w:rtl w:val="0"/>
+                <w:lang w:val="ru-RU"/>
               </w:rPr>
               <w:t>.</w:t>
             </w:r>
@@ -1756,6 +1764,7 @@
               <w:rPr>
                 <w:shd w:val="nil" w:color="auto" w:fill="auto"/>
                 <w:rtl w:val="0"/>
+                <w:lang w:val="ru-RU"/>
               </w:rPr>
               <w:t>Каразіна</w:t>
             </w:r>
@@ -1763,7 +1772,7 @@
         </w:tc>
         <w:tc>
           <w:tcPr>
-            <w:tcW w:type="dxa" w:w="1216"/>
+            <w:tcW w:type="dxa" w:w="1215"/>
             <w:tcBorders>
               <w:top w:val="single" w:color="000000" w:sz="4" w:space="0" w:shadow="0" w:frame="0"/>
               <w:left w:val="single" w:color="000000" w:sz="4" w:space="0" w:shadow="0" w:frame="0"/>
@@ -1787,6 +1796,7 @@
                 <w:b w:val="1"/>
                 <w:bCs w:val="1"/>
                 <w:shd w:val="nil" w:color="auto" w:fill="auto"/>
+                <w:lang w:val="ru-RU"/>
               </w:rPr>
             </w:pPr>
           </w:p>
@@ -1806,6 +1816,7 @@
                 <w:bCs w:val="1"/>
                 <w:shd w:val="nil" w:color="auto" w:fill="auto"/>
                 <w:rtl w:val="0"/>
+                <w:lang w:val="ru-RU"/>
               </w:rPr>
               <w:t>152</w:t>
             </w:r>
@@ -1813,44 +1824,46 @@
         </w:tc>
         <w:tc>
           <w:tcPr>
-            <w:tcW w:type="dxa" w:w="1836"/>
-            <w:tcBorders>
-              <w:top w:val="single" w:color="000000" w:sz="4" w:space="0" w:shadow="0" w:frame="0"/>
-              <w:left w:val="single" w:color="000000" w:sz="4" w:space="0" w:shadow="0" w:frame="0"/>
-              <w:bottom w:val="single" w:color="000000" w:sz="4" w:space="0" w:shadow="0" w:frame="0"/>
-              <w:right w:val="single" w:color="000000" w:sz="4" w:space="0" w:shadow="0" w:frame="0"/>
-            </w:tcBorders>
-            <w:shd w:val="clear" w:color="auto" w:fill="auto"/>
-            <w:tcMar>
-              <w:top w:type="dxa" w:w="80"/>
-              <w:left w:type="dxa" w:w="80"/>
-              <w:bottom w:type="dxa" w:w="80"/>
-              <w:right w:type="dxa" w:w="80"/>
-            </w:tcMar>
-            <w:vAlign w:val="top"/>
-          </w:tcPr>
-          <w:p>
-            <w:pPr>
-              <w:pStyle w:val="Обычный"/>
-              <w:rPr>
-                <w:shd w:val="nil" w:color="auto" w:fill="auto"/>
-              </w:rPr>
-            </w:pPr>
-          </w:p>
-          <w:p>
-            <w:pPr>
-              <w:pStyle w:val="Обычный"/>
-              <w:bidi w:val="0"/>
-              <w:ind w:left="0" w:right="0" w:firstLine="0"/>
-              <w:jc w:val="center"/>
-              <w:rPr>
-                <w:rtl w:val="0"/>
-              </w:rPr>
-            </w:pPr>
-            <w:r>
-              <w:rPr>
-                <w:shd w:val="nil" w:color="auto" w:fill="auto"/>
-                <w:rtl w:val="0"/>
+            <w:tcW w:type="dxa" w:w="1837"/>
+            <w:tcBorders>
+              <w:top w:val="single" w:color="000000" w:sz="4" w:space="0" w:shadow="0" w:frame="0"/>
+              <w:left w:val="single" w:color="000000" w:sz="4" w:space="0" w:shadow="0" w:frame="0"/>
+              <w:bottom w:val="single" w:color="000000" w:sz="4" w:space="0" w:shadow="0" w:frame="0"/>
+              <w:right w:val="single" w:color="000000" w:sz="4" w:space="0" w:shadow="0" w:frame="0"/>
+            </w:tcBorders>
+            <w:shd w:val="clear" w:color="auto" w:fill="auto"/>
+            <w:tcMar>
+              <w:top w:type="dxa" w:w="80"/>
+              <w:left w:type="dxa" w:w="80"/>
+              <w:bottom w:type="dxa" w:w="80"/>
+              <w:right w:type="dxa" w:w="80"/>
+            </w:tcMar>
+            <w:vAlign w:val="top"/>
+          </w:tcPr>
+          <w:p>
+            <w:pPr>
+              <w:pStyle w:val="Обычный"/>
+              <w:rPr>
+                <w:shd w:val="nil" w:color="auto" w:fill="auto"/>
+                <w:lang w:val="ru-RU"/>
+              </w:rPr>
+            </w:pPr>
+          </w:p>
+          <w:p>
+            <w:pPr>
+              <w:pStyle w:val="Обычный"/>
+              <w:bidi w:val="0"/>
+              <w:ind w:left="0" w:right="0" w:firstLine="0"/>
+              <w:jc w:val="center"/>
+              <w:rPr>
+                <w:rtl w:val="0"/>
+              </w:rPr>
+            </w:pPr>
+            <w:r>
+              <w:rPr>
+                <w:shd w:val="nil" w:color="auto" w:fill="auto"/>
+                <w:rtl w:val="0"/>
+                <w:lang w:val="ru-RU"/>
               </w:rPr>
               <w:t>----</w:t>
             </w:r>
@@ -1862,7 +1875,7 @@
           <w:shd w:val="clear" w:color="auto" w:fill="ced7e7"/>
         </w:tblPrEx>
         <w:trPr>
-          <w:trHeight w:val="900" w:hRule="atLeast"/>
+          <w:trHeight w:val="910" w:hRule="atLeast"/>
         </w:trPr>
         <w:tc>
           <w:tcPr>
@@ -1894,6 +1907,7 @@
               <w:rPr>
                 <w:shd w:val="nil" w:color="auto" w:fill="auto"/>
                 <w:rtl w:val="0"/>
+                <w:lang w:val="ru-RU"/>
               </w:rPr>
               <w:t xml:space="preserve">Фінали </w:t>
             </w:r>
@@ -1901,6 +1915,7 @@
               <w:rPr>
                 <w:shd w:val="nil" w:color="auto" w:fill="auto"/>
                 <w:rtl w:val="0"/>
+                <w:lang w:val="ru-RU"/>
               </w:rPr>
               <w:t>70</w:t>
             </w:r>
@@ -1908,6 +1923,7 @@
               <w:rPr>
                 <w:shd w:val="nil" w:color="auto" w:fill="auto"/>
                 <w:rtl w:val="0"/>
+                <w:lang w:val="ru-RU"/>
               </w:rPr>
               <w:t>м</w:t>
             </w:r>
@@ -1926,6 +1942,7 @@
               <w:rPr>
                 <w:shd w:val="nil" w:color="auto" w:fill="auto"/>
                 <w:rtl w:val="0"/>
+                <w:lang w:val="ru-RU"/>
               </w:rPr>
               <w:t xml:space="preserve">16 </w:t>
             </w:r>
@@ -1933,6 +1950,7 @@
               <w:rPr>
                 <w:shd w:val="nil" w:color="auto" w:fill="auto"/>
                 <w:rtl w:val="0"/>
+                <w:lang w:val="ru-RU"/>
               </w:rPr>
               <w:t>стр</w:t>
             </w:r>
@@ -1940,6 +1958,7 @@
               <w:rPr>
                 <w:shd w:val="nil" w:color="auto" w:fill="auto"/>
                 <w:rtl w:val="0"/>
+                <w:lang w:val="ru-RU"/>
               </w:rPr>
               <w:t>.</w:t>
             </w:r>
@@ -1975,6 +1994,7 @@
               <w:rPr>
                 <w:shd w:val="nil" w:color="auto" w:fill="auto"/>
                 <w:rtl w:val="0"/>
+                <w:lang w:val="ru-RU"/>
               </w:rPr>
               <w:t>Д’якова Вікторія</w:t>
             </w:r>
@@ -1993,6 +2013,7 @@
               <w:rPr>
                 <w:shd w:val="nil" w:color="auto" w:fill="auto"/>
                 <w:rtl w:val="0"/>
+                <w:lang w:val="ru-RU"/>
               </w:rPr>
               <w:t>Гуров Олег</w:t>
             </w:r>
@@ -2022,23 +2043,25 @@
               <w:jc w:val="center"/>
               <w:rPr>
                 <w:shd w:val="nil" w:color="auto" w:fill="auto"/>
-              </w:rPr>
-            </w:pPr>
-          </w:p>
-          <w:p>
-            <w:pPr>
-              <w:pStyle w:val="Обычный"/>
-              <w:bidi w:val="0"/>
-              <w:ind w:left="0" w:right="0" w:firstLine="0"/>
-              <w:jc w:val="center"/>
-              <w:rPr>
-                <w:rtl w:val="0"/>
-              </w:rPr>
-            </w:pPr>
-            <w:r>
-              <w:rPr>
-                <w:shd w:val="nil" w:color="auto" w:fill="auto"/>
-                <w:rtl w:val="0"/>
+                <w:lang w:val="ru-RU"/>
+              </w:rPr>
+            </w:pPr>
+          </w:p>
+          <w:p>
+            <w:pPr>
+              <w:pStyle w:val="Обычный"/>
+              <w:bidi w:val="0"/>
+              <w:ind w:left="0" w:right="0" w:firstLine="0"/>
+              <w:jc w:val="center"/>
+              <w:rPr>
+                <w:rtl w:val="0"/>
+              </w:rPr>
+            </w:pPr>
+            <w:r>
+              <w:rPr>
+                <w:shd w:val="nil" w:color="auto" w:fill="auto"/>
+                <w:rtl w:val="0"/>
+                <w:lang w:val="ru-RU"/>
               </w:rPr>
               <w:t>09-15.09.2012</w:t>
             </w:r>
@@ -2046,45 +2069,47 @@
         </w:tc>
         <w:tc>
           <w:tcPr>
-            <w:tcW w:type="dxa" w:w="3117"/>
-            <w:tcBorders>
-              <w:top w:val="single" w:color="000000" w:sz="4" w:space="0" w:shadow="0" w:frame="0"/>
-              <w:left w:val="single" w:color="000000" w:sz="4" w:space="0" w:shadow="0" w:frame="0"/>
-              <w:bottom w:val="single" w:color="000000" w:sz="4" w:space="0" w:shadow="0" w:frame="0"/>
-              <w:right w:val="single" w:color="000000" w:sz="4" w:space="0" w:shadow="0" w:frame="0"/>
-            </w:tcBorders>
-            <w:shd w:val="clear" w:color="auto" w:fill="auto"/>
-            <w:tcMar>
-              <w:top w:type="dxa" w:w="80"/>
-              <w:left w:type="dxa" w:w="80"/>
-              <w:bottom w:type="dxa" w:w="80"/>
-              <w:right w:type="dxa" w:w="80"/>
-            </w:tcMar>
-            <w:vAlign w:val="top"/>
-          </w:tcPr>
-          <w:p>
-            <w:pPr>
-              <w:pStyle w:val="Обычный"/>
-              <w:jc w:val="center"/>
-              <w:rPr>
-                <w:shd w:val="nil" w:color="auto" w:fill="auto"/>
-              </w:rPr>
-            </w:pPr>
-          </w:p>
-          <w:p>
-            <w:pPr>
-              <w:pStyle w:val="Обычный"/>
-              <w:bidi w:val="0"/>
-              <w:ind w:left="0" w:right="0" w:firstLine="0"/>
-              <w:jc w:val="center"/>
-              <w:rPr>
-                <w:rtl w:val="0"/>
-              </w:rPr>
-            </w:pPr>
-            <w:r>
-              <w:rPr>
-                <w:shd w:val="nil" w:color="auto" w:fill="auto"/>
-                <w:rtl w:val="0"/>
+            <w:tcW w:type="dxa" w:w="3118"/>
+            <w:tcBorders>
+              <w:top w:val="single" w:color="000000" w:sz="4" w:space="0" w:shadow="0" w:frame="0"/>
+              <w:left w:val="single" w:color="000000" w:sz="4" w:space="0" w:shadow="0" w:frame="0"/>
+              <w:bottom w:val="single" w:color="000000" w:sz="4" w:space="0" w:shadow="0" w:frame="0"/>
+              <w:right w:val="single" w:color="000000" w:sz="4" w:space="0" w:shadow="0" w:frame="0"/>
+            </w:tcBorders>
+            <w:shd w:val="clear" w:color="auto" w:fill="auto"/>
+            <w:tcMar>
+              <w:top w:type="dxa" w:w="80"/>
+              <w:left w:type="dxa" w:w="80"/>
+              <w:bottom w:type="dxa" w:w="80"/>
+              <w:right w:type="dxa" w:w="80"/>
+            </w:tcMar>
+            <w:vAlign w:val="top"/>
+          </w:tcPr>
+          <w:p>
+            <w:pPr>
+              <w:pStyle w:val="Обычный"/>
+              <w:jc w:val="center"/>
+              <w:rPr>
+                <w:shd w:val="nil" w:color="auto" w:fill="auto"/>
+                <w:lang w:val="ru-RU"/>
+              </w:rPr>
+            </w:pPr>
+          </w:p>
+          <w:p>
+            <w:pPr>
+              <w:pStyle w:val="Обычный"/>
+              <w:bidi w:val="0"/>
+              <w:ind w:left="0" w:right="0" w:firstLine="0"/>
+              <w:jc w:val="center"/>
+              <w:rPr>
+                <w:rtl w:val="0"/>
+              </w:rPr>
+            </w:pPr>
+            <w:r>
+              <w:rPr>
+                <w:shd w:val="nil" w:color="auto" w:fill="auto"/>
+                <w:rtl w:val="0"/>
+                <w:lang w:val="ru-RU"/>
               </w:rPr>
               <w:t>Львів</w:t>
             </w:r>
@@ -2092,6 +2117,7 @@
               <w:rPr>
                 <w:shd w:val="nil" w:color="auto" w:fill="auto"/>
                 <w:rtl w:val="0"/>
+                <w:lang w:val="ru-RU"/>
               </w:rPr>
               <w:t xml:space="preserve">, </w:t>
             </w:r>
@@ -2099,6 +2125,7 @@
               <w:rPr>
                 <w:shd w:val="nil" w:color="auto" w:fill="auto"/>
                 <w:rtl w:val="0"/>
+                <w:lang w:val="ru-RU"/>
               </w:rPr>
               <w:t>«Золота осінь»</w:t>
             </w:r>
@@ -2106,45 +2133,47 @@
         </w:tc>
         <w:tc>
           <w:tcPr>
-            <w:tcW w:type="dxa" w:w="2552"/>
-            <w:tcBorders>
-              <w:top w:val="single" w:color="000000" w:sz="4" w:space="0" w:shadow="0" w:frame="0"/>
-              <w:left w:val="single" w:color="000000" w:sz="4" w:space="0" w:shadow="0" w:frame="0"/>
-              <w:bottom w:val="single" w:color="000000" w:sz="4" w:space="0" w:shadow="0" w:frame="0"/>
-              <w:right w:val="single" w:color="000000" w:sz="4" w:space="0" w:shadow="0" w:frame="0"/>
-            </w:tcBorders>
-            <w:shd w:val="clear" w:color="auto" w:fill="auto"/>
-            <w:tcMar>
-              <w:top w:type="dxa" w:w="80"/>
-              <w:left w:type="dxa" w:w="80"/>
-              <w:bottom w:type="dxa" w:w="80"/>
-              <w:right w:type="dxa" w:w="80"/>
-            </w:tcMar>
-            <w:vAlign w:val="top"/>
-          </w:tcPr>
-          <w:p>
-            <w:pPr>
-              <w:pStyle w:val="Обычный"/>
-              <w:jc w:val="center"/>
-              <w:rPr>
-                <w:shd w:val="nil" w:color="auto" w:fill="auto"/>
-              </w:rPr>
-            </w:pPr>
-          </w:p>
-          <w:p>
-            <w:pPr>
-              <w:pStyle w:val="Обычный"/>
-              <w:bidi w:val="0"/>
-              <w:ind w:left="0" w:right="0" w:firstLine="0"/>
-              <w:jc w:val="center"/>
-              <w:rPr>
-                <w:rtl w:val="0"/>
-              </w:rPr>
-            </w:pPr>
-            <w:r>
-              <w:rPr>
-                <w:shd w:val="nil" w:color="auto" w:fill="auto"/>
-                <w:rtl w:val="0"/>
+            <w:tcW w:type="dxa" w:w="2553"/>
+            <w:tcBorders>
+              <w:top w:val="single" w:color="000000" w:sz="4" w:space="0" w:shadow="0" w:frame="0"/>
+              <w:left w:val="single" w:color="000000" w:sz="4" w:space="0" w:shadow="0" w:frame="0"/>
+              <w:bottom w:val="single" w:color="000000" w:sz="4" w:space="0" w:shadow="0" w:frame="0"/>
+              <w:right w:val="single" w:color="000000" w:sz="4" w:space="0" w:shadow="0" w:frame="0"/>
+            </w:tcBorders>
+            <w:shd w:val="clear" w:color="auto" w:fill="auto"/>
+            <w:tcMar>
+              <w:top w:type="dxa" w:w="80"/>
+              <w:left w:type="dxa" w:w="80"/>
+              <w:bottom w:type="dxa" w:w="80"/>
+              <w:right w:type="dxa" w:w="80"/>
+            </w:tcMar>
+            <w:vAlign w:val="top"/>
+          </w:tcPr>
+          <w:p>
+            <w:pPr>
+              <w:pStyle w:val="Обычный"/>
+              <w:jc w:val="center"/>
+              <w:rPr>
+                <w:shd w:val="nil" w:color="auto" w:fill="auto"/>
+                <w:lang w:val="ru-RU"/>
+              </w:rPr>
+            </w:pPr>
+          </w:p>
+          <w:p>
+            <w:pPr>
+              <w:pStyle w:val="Обычный"/>
+              <w:bidi w:val="0"/>
+              <w:ind w:left="0" w:right="0" w:firstLine="0"/>
+              <w:jc w:val="center"/>
+              <w:rPr>
+                <w:rtl w:val="0"/>
+              </w:rPr>
+            </w:pPr>
+            <w:r>
+              <w:rPr>
+                <w:shd w:val="nil" w:color="auto" w:fill="auto"/>
+                <w:rtl w:val="0"/>
+                <w:lang w:val="ru-RU"/>
               </w:rPr>
               <w:t>Харківська</w:t>
             </w:r>
@@ -2152,7 +2181,7 @@
         </w:tc>
         <w:tc>
           <w:tcPr>
-            <w:tcW w:type="dxa" w:w="1216"/>
+            <w:tcW w:type="dxa" w:w="1215"/>
             <w:tcBorders>
               <w:top w:val="single" w:color="000000" w:sz="4" w:space="0" w:shadow="0" w:frame="0"/>
               <w:left w:val="single" w:color="000000" w:sz="4" w:space="0" w:shadow="0" w:frame="0"/>
@@ -2176,6 +2205,7 @@
                 <w:b w:val="1"/>
                 <w:bCs w:val="1"/>
                 <w:shd w:val="nil" w:color="auto" w:fill="auto"/>
+                <w:lang w:val="ru-RU"/>
               </w:rPr>
             </w:pPr>
           </w:p>
@@ -2195,6 +2225,7 @@
                 <w:bCs w:val="1"/>
                 <w:shd w:val="nil" w:color="auto" w:fill="auto"/>
                 <w:rtl w:val="0"/>
+                <w:lang w:val="ru-RU"/>
               </w:rPr>
               <w:t>149</w:t>
             </w:r>
@@ -2202,56 +2233,65 @@
         </w:tc>
         <w:tc>
           <w:tcPr>
-            <w:tcW w:type="dxa" w:w="1836"/>
-            <w:tcBorders>
-              <w:top w:val="single" w:color="000000" w:sz="4" w:space="0" w:shadow="0" w:frame="0"/>
-              <w:left w:val="single" w:color="000000" w:sz="4" w:space="0" w:shadow="0" w:frame="0"/>
-              <w:bottom w:val="single" w:color="000000" w:sz="4" w:space="0" w:shadow="0" w:frame="0"/>
-              <w:right w:val="single" w:color="000000" w:sz="4" w:space="0" w:shadow="0" w:frame="0"/>
-            </w:tcBorders>
-            <w:shd w:val="clear" w:color="auto" w:fill="auto"/>
-            <w:tcMar>
-              <w:top w:type="dxa" w:w="80"/>
-              <w:left w:type="dxa" w:w="80"/>
-              <w:bottom w:type="dxa" w:w="80"/>
-              <w:right w:type="dxa" w:w="80"/>
-            </w:tcMar>
-            <w:vAlign w:val="top"/>
-          </w:tcPr>
-          <w:p>
-            <w:pPr>
-              <w:pStyle w:val="Обычный"/>
-              <w:rPr>
-                <w:shd w:val="nil" w:color="auto" w:fill="auto"/>
-              </w:rPr>
-            </w:pPr>
-          </w:p>
-          <w:p>
-            <w:pPr>
-              <w:pStyle w:val="Обычный"/>
-              <w:bidi w:val="0"/>
-              <w:ind w:left="0" w:right="0" w:firstLine="0"/>
-              <w:jc w:val="center"/>
-              <w:rPr>
-                <w:rtl w:val="0"/>
-              </w:rPr>
-            </w:pPr>
-            <w:r>
-              <w:rPr>
-                <w:shd w:val="nil" w:color="auto" w:fill="auto"/>
-                <w:rtl w:val="0"/>
+            <w:tcW w:type="dxa" w:w="1837"/>
+            <w:tcBorders>
+              <w:top w:val="single" w:color="000000" w:sz="4" w:space="0" w:shadow="0" w:frame="0"/>
+              <w:left w:val="single" w:color="000000" w:sz="4" w:space="0" w:shadow="0" w:frame="0"/>
+              <w:bottom w:val="single" w:color="000000" w:sz="4" w:space="0" w:shadow="0" w:frame="0"/>
+              <w:right w:val="single" w:color="000000" w:sz="4" w:space="0" w:shadow="0" w:frame="0"/>
+            </w:tcBorders>
+            <w:shd w:val="clear" w:color="auto" w:fill="auto"/>
+            <w:tcMar>
+              <w:top w:type="dxa" w:w="80"/>
+              <w:left w:type="dxa" w:w="80"/>
+              <w:bottom w:type="dxa" w:w="80"/>
+              <w:right w:type="dxa" w:w="80"/>
+            </w:tcMar>
+            <w:vAlign w:val="top"/>
+          </w:tcPr>
+          <w:p>
+            <w:pPr>
+              <w:pStyle w:val="Обычный"/>
+              <w:rPr>
+                <w:shd w:val="nil" w:color="auto" w:fill="auto"/>
+                <w:lang w:val="ru-RU"/>
+              </w:rPr>
+            </w:pPr>
+          </w:p>
+          <w:p>
+            <w:pPr>
+              <w:pStyle w:val="Обычный"/>
+              <w:bidi w:val="0"/>
+              <w:ind w:left="0" w:right="0" w:firstLine="0"/>
+              <w:jc w:val="center"/>
+              <w:rPr>
+                <w:rtl w:val="0"/>
+              </w:rPr>
+            </w:pPr>
+            <w:r>
+              <w:rPr>
+                <w:shd w:val="nil" w:color="auto" w:fill="auto"/>
+                <w:rtl w:val="0"/>
+                <w:lang w:val="ru-RU"/>
               </w:rPr>
               <w:t>----</w:t>
-            </w:r>
-            <w:r>
-              <w:rPr>
-                <w:shd w:val="nil" w:color="auto" w:fill="auto"/>
-              </w:rPr>
             </w:r>
           </w:p>
         </w:tc>
       </w:tr>
     </w:tbl>
+    <w:p>
+      <w:pPr>
+        <w:pStyle w:val="Обычный"/>
+        <w:widowControl w:val="0"/>
+        <w:ind w:left="108" w:hanging="108"/>
+        <w:jc w:val="center"/>
+        <w:rPr>
+          <w:b w:val="1"/>
+          <w:bCs w:val="1"/>
+        </w:rPr>
+      </w:pPr>
+    </w:p>
     <w:p>
       <w:pPr>
         <w:pStyle w:val="Обычный"/>
@@ -2307,22 +2347,14 @@
           <w:rtl w:val="0"/>
           <w:lang w:val="ru-RU"/>
         </w:rPr>
-        <w:t>в Укра</w:t>
-      </w:r>
-      <w:r>
-        <w:rPr>
-          <w:b w:val="1"/>
-          <w:bCs w:val="1"/>
-          <w:rtl w:val="0"/>
-        </w:rPr>
-        <w:t xml:space="preserve">їни серед змішаних команд </w:t>
+        <w:t xml:space="preserve">в України серед змішаних команд </w:t>
       </w:r>
     </w:p>
     <w:tbl>
       <w:tblPr>
         <w:tblW w:w="14786" w:type="dxa"/>
         <w:jc w:val="center"/>
-        <w:tblInd w:w="108" w:type="dxa"/>
+        <w:tblInd w:w="216" w:type="dxa"/>
         <w:tblBorders>
           <w:top w:val="single" w:color="ffffff" w:sz="8" w:space="0" w:shadow="0" w:frame="0"/>
           <w:left w:val="single" w:color="ffffff" w:sz="8" w:space="0" w:shadow="0" w:frame="0"/>
@@ -2348,7 +2380,7 @@
           <w:shd w:val="clear" w:color="auto" w:fill="ced7e7"/>
         </w:tblPrEx>
         <w:trPr>
-          <w:trHeight w:val="300" w:hRule="atLeast"/>
+          <w:trHeight w:val="310" w:hRule="atLeast"/>
         </w:trPr>
         <w:tc>
           <w:tcPr>
@@ -2377,6 +2409,7 @@
               <w:rPr>
                 <w:shd w:val="nil" w:color="auto" w:fill="auto"/>
                 <w:rtl w:val="0"/>
+                <w:lang w:val="ru-RU"/>
               </w:rPr>
               <w:t>Вправа</w:t>
             </w:r>
@@ -2409,6 +2442,7 @@
               <w:rPr>
                 <w:shd w:val="nil" w:color="auto" w:fill="auto"/>
                 <w:rtl w:val="0"/>
+                <w:lang w:val="ru-RU"/>
               </w:rPr>
               <w:t>Склад команди</w:t>
             </w:r>
@@ -2441,6 +2475,7 @@
               <w:rPr>
                 <w:shd w:val="nil" w:color="auto" w:fill="auto"/>
                 <w:rtl w:val="0"/>
+                <w:lang w:val="ru-RU"/>
               </w:rPr>
               <w:t>Дата</w:t>
             </w:r>
@@ -2473,6 +2508,7 @@
               <w:rPr>
                 <w:shd w:val="nil" w:color="auto" w:fill="auto"/>
                 <w:rtl w:val="0"/>
+                <w:lang w:val="ru-RU"/>
               </w:rPr>
               <w:t>Місце встановлення</w:t>
             </w:r>
@@ -2505,6 +2541,7 @@
               <w:rPr>
                 <w:shd w:val="nil" w:color="auto" w:fill="auto"/>
                 <w:rtl w:val="0"/>
+                <w:lang w:val="ru-RU"/>
               </w:rPr>
               <w:t>Клуб</w:t>
             </w:r>
@@ -2512,6 +2549,7 @@
               <w:rPr>
                 <w:shd w:val="nil" w:color="auto" w:fill="auto"/>
                 <w:rtl w:val="0"/>
+                <w:lang w:val="ru-RU"/>
               </w:rPr>
               <w:t>,</w:t>
             </w:r>
@@ -2519,6 +2557,7 @@
               <w:rPr>
                 <w:shd w:val="nil" w:color="auto" w:fill="auto"/>
                 <w:rtl w:val="0"/>
+                <w:lang w:val="ru-RU"/>
               </w:rPr>
               <w:t>сп</w:t>
             </w:r>
@@ -2526,6 +2565,7 @@
               <w:rPr>
                 <w:shd w:val="nil" w:color="auto" w:fill="auto"/>
                 <w:rtl w:val="0"/>
+                <w:lang w:val="ru-RU"/>
               </w:rPr>
               <w:t>.</w:t>
             </w:r>
@@ -2533,6 +2573,7 @@
               <w:rPr>
                 <w:shd w:val="nil" w:color="auto" w:fill="auto"/>
                 <w:rtl w:val="0"/>
+                <w:lang w:val="ru-RU"/>
               </w:rPr>
               <w:t>товариство</w:t>
             </w:r>
@@ -2565,6 +2606,7 @@
               <w:rPr>
                 <w:shd w:val="nil" w:color="auto" w:fill="auto"/>
                 <w:rtl w:val="0"/>
+                <w:lang w:val="ru-RU"/>
               </w:rPr>
               <w:t>Результат</w:t>
             </w:r>
@@ -2597,6 +2639,7 @@
               <w:rPr>
                 <w:shd w:val="nil" w:color="auto" w:fill="auto"/>
                 <w:rtl w:val="0"/>
+                <w:lang w:val="ru-RU"/>
               </w:rPr>
               <w:t>М</w:t>
             </w:r>
@@ -2604,6 +2647,7 @@
               <w:rPr>
                 <w:shd w:val="nil" w:color="auto" w:fill="auto"/>
                 <w:rtl w:val="0"/>
+                <w:lang w:val="ru-RU"/>
               </w:rPr>
               <w:t xml:space="preserve">3 </w:t>
             </w:r>
@@ -2611,6 +2655,7 @@
               <w:rPr>
                 <w:shd w:val="nil" w:color="auto" w:fill="auto"/>
                 <w:rtl w:val="0"/>
+                <w:lang w:val="ru-RU"/>
               </w:rPr>
               <w:t>п</w:t>
             </w:r>
@@ -2618,6 +2663,7 @@
               <w:rPr>
                 <w:shd w:val="nil" w:color="auto" w:fill="auto"/>
                 <w:rtl w:val="0"/>
+                <w:lang w:val="ru-RU"/>
               </w:rPr>
               <w:t>/</w:t>
             </w:r>
@@ -2625,6 +2671,7 @@
               <w:rPr>
                 <w:shd w:val="nil" w:color="auto" w:fill="auto"/>
                 <w:rtl w:val="0"/>
+                <w:lang w:val="ru-RU"/>
               </w:rPr>
               <w:t>п</w:t>
             </w:r>
@@ -2636,7 +2683,7 @@
           <w:shd w:val="clear" w:color="auto" w:fill="ced7e7"/>
         </w:tblPrEx>
         <w:trPr>
-          <w:trHeight w:val="900" w:hRule="atLeast"/>
+          <w:trHeight w:val="910" w:hRule="atLeast"/>
         </w:trPr>
         <w:tc>
           <w:tcPr>
@@ -2668,6 +2715,7 @@
               <w:rPr>
                 <w:shd w:val="nil" w:color="auto" w:fill="auto"/>
                 <w:rtl w:val="0"/>
+                <w:lang w:val="ru-RU"/>
               </w:rPr>
               <w:t>Командний</w:t>
             </w:r>
@@ -2687,6 +2735,7 @@
               <w:rPr>
                 <w:shd w:val="nil" w:color="auto" w:fill="auto"/>
                 <w:rtl w:val="0"/>
+                <w:lang w:val="ru-RU"/>
               </w:rPr>
               <w:t>елімінаційний</w:t>
             </w:r>
@@ -2705,6 +2754,7 @@
               <w:rPr>
                 <w:shd w:val="nil" w:color="auto" w:fill="auto"/>
                 <w:rtl w:val="0"/>
+                <w:lang w:val="ru-RU"/>
               </w:rPr>
               <w:t xml:space="preserve">раунд </w:t>
             </w:r>
@@ -2712,6 +2762,7 @@
               <w:rPr>
                 <w:shd w:val="nil" w:color="auto" w:fill="auto"/>
                 <w:rtl w:val="0"/>
+                <w:lang w:val="ru-RU"/>
               </w:rPr>
               <w:t>2</w:t>
             </w:r>
@@ -2719,6 +2770,7 @@
               <w:rPr>
                 <w:shd w:val="nil" w:color="auto" w:fill="auto"/>
                 <w:rtl w:val="0"/>
+                <w:lang w:val="ru-RU"/>
               </w:rPr>
               <w:t>х</w:t>
             </w:r>
@@ -2726,6 +2778,7 @@
               <w:rPr>
                 <w:shd w:val="nil" w:color="auto" w:fill="auto"/>
                 <w:rtl w:val="0"/>
+                <w:lang w:val="ru-RU"/>
               </w:rPr>
               <w:t>50</w:t>
             </w:r>
@@ -2761,6 +2814,7 @@
               <w:rPr>
                 <w:shd w:val="nil" w:color="auto" w:fill="auto"/>
                 <w:rtl w:val="0"/>
+                <w:lang w:val="ru-RU"/>
               </w:rPr>
               <w:t>Пимоненко Михайло</w:t>
             </w:r>
@@ -2779,6 +2833,7 @@
               <w:rPr>
                 <w:shd w:val="nil" w:color="auto" w:fill="auto"/>
                 <w:rtl w:val="0"/>
+                <w:lang w:val="ru-RU"/>
               </w:rPr>
               <w:t>Куріцина Діна</w:t>
             </w:r>
@@ -2808,23 +2863,25 @@
               <w:jc w:val="center"/>
               <w:rPr>
                 <w:shd w:val="nil" w:color="auto" w:fill="auto"/>
-              </w:rPr>
-            </w:pPr>
-          </w:p>
-          <w:p>
-            <w:pPr>
-              <w:pStyle w:val="Обычный"/>
-              <w:bidi w:val="0"/>
-              <w:ind w:left="0" w:right="0" w:firstLine="0"/>
-              <w:jc w:val="center"/>
-              <w:rPr>
-                <w:rtl w:val="0"/>
-              </w:rPr>
-            </w:pPr>
-            <w:r>
-              <w:rPr>
-                <w:shd w:val="nil" w:color="auto" w:fill="auto"/>
-                <w:rtl w:val="0"/>
+                <w:lang w:val="ru-RU"/>
+              </w:rPr>
+            </w:pPr>
+          </w:p>
+          <w:p>
+            <w:pPr>
+              <w:pStyle w:val="Обычный"/>
+              <w:bidi w:val="0"/>
+              <w:ind w:left="0" w:right="0" w:firstLine="0"/>
+              <w:jc w:val="center"/>
+              <w:rPr>
+                <w:rtl w:val="0"/>
+              </w:rPr>
+            </w:pPr>
+            <w:r>
+              <w:rPr>
+                <w:shd w:val="nil" w:color="auto" w:fill="auto"/>
+                <w:rtl w:val="0"/>
+                <w:lang w:val="ru-RU"/>
               </w:rPr>
               <w:t>26-29.07.2012</w:t>
             </w:r>
@@ -2854,23 +2911,25 @@
               <w:jc w:val="center"/>
               <w:rPr>
                 <w:shd w:val="nil" w:color="auto" w:fill="auto"/>
-              </w:rPr>
-            </w:pPr>
-          </w:p>
-          <w:p>
-            <w:pPr>
-              <w:pStyle w:val="Обычный"/>
-              <w:bidi w:val="0"/>
-              <w:ind w:left="0" w:right="0" w:firstLine="0"/>
-              <w:jc w:val="center"/>
-              <w:rPr>
-                <w:rtl w:val="0"/>
-              </w:rPr>
-            </w:pPr>
-            <w:r>
-              <w:rPr>
-                <w:shd w:val="nil" w:color="auto" w:fill="auto"/>
-                <w:rtl w:val="0"/>
+                <w:lang w:val="ru-RU"/>
+              </w:rPr>
+            </w:pPr>
+          </w:p>
+          <w:p>
+            <w:pPr>
+              <w:pStyle w:val="Обычный"/>
+              <w:bidi w:val="0"/>
+              <w:ind w:left="0" w:right="0" w:firstLine="0"/>
+              <w:jc w:val="center"/>
+              <w:rPr>
+                <w:rtl w:val="0"/>
+              </w:rPr>
+            </w:pPr>
+            <w:r>
+              <w:rPr>
+                <w:shd w:val="nil" w:color="auto" w:fill="auto"/>
+                <w:rtl w:val="0"/>
+                <w:lang w:val="ru-RU"/>
               </w:rPr>
               <w:t>Львів</w:t>
             </w:r>
@@ -2878,6 +2937,7 @@
               <w:rPr>
                 <w:shd w:val="nil" w:color="auto" w:fill="auto"/>
                 <w:rtl w:val="0"/>
+                <w:lang w:val="ru-RU"/>
               </w:rPr>
               <w:t xml:space="preserve">, </w:t>
             </w:r>
@@ -2885,6 +2945,7 @@
               <w:rPr>
                 <w:shd w:val="nil" w:color="auto" w:fill="auto"/>
                 <w:rtl w:val="0"/>
+                <w:lang w:val="ru-RU"/>
               </w:rPr>
               <w:t>Чемпіонат України</w:t>
             </w:r>
@@ -2914,23 +2975,25 @@
               <w:jc w:val="center"/>
               <w:rPr>
                 <w:shd w:val="nil" w:color="auto" w:fill="auto"/>
-              </w:rPr>
-            </w:pPr>
-          </w:p>
-          <w:p>
-            <w:pPr>
-              <w:pStyle w:val="Обычный"/>
-              <w:bidi w:val="0"/>
-              <w:ind w:left="0" w:right="0" w:firstLine="0"/>
-              <w:jc w:val="center"/>
-              <w:rPr>
-                <w:rtl w:val="0"/>
-              </w:rPr>
-            </w:pPr>
-            <w:r>
-              <w:rPr>
-                <w:shd w:val="nil" w:color="auto" w:fill="auto"/>
-                <w:rtl w:val="0"/>
+                <w:lang w:val="ru-RU"/>
+              </w:rPr>
+            </w:pPr>
+          </w:p>
+          <w:p>
+            <w:pPr>
+              <w:pStyle w:val="Обычный"/>
+              <w:bidi w:val="0"/>
+              <w:ind w:left="0" w:right="0" w:firstLine="0"/>
+              <w:jc w:val="center"/>
+              <w:rPr>
+                <w:rtl w:val="0"/>
+              </w:rPr>
+            </w:pPr>
+            <w:r>
+              <w:rPr>
+                <w:shd w:val="nil" w:color="auto" w:fill="auto"/>
+                <w:rtl w:val="0"/>
+                <w:lang w:val="ru-RU"/>
               </w:rPr>
               <w:t>КДЮСШ «Олімп»</w:t>
             </w:r>
@@ -2962,6 +3025,7 @@
                 <w:b w:val="1"/>
                 <w:bCs w:val="1"/>
                 <w:shd w:val="nil" w:color="auto" w:fill="auto"/>
+                <w:lang w:val="ru-RU"/>
               </w:rPr>
             </w:pPr>
           </w:p>
@@ -2981,6 +3045,7 @@
                 <w:bCs w:val="1"/>
                 <w:shd w:val="nil" w:color="auto" w:fill="auto"/>
                 <w:rtl w:val="0"/>
+                <w:lang w:val="ru-RU"/>
               </w:rPr>
               <w:t>1383</w:t>
             </w:r>
@@ -3016,6 +3081,7 @@
               <w:rPr>
                 <w:shd w:val="nil" w:color="auto" w:fill="auto"/>
                 <w:rtl w:val="0"/>
+                <w:lang w:val="ru-RU"/>
               </w:rPr>
               <w:t>348,350</w:t>
             </w:r>
@@ -3034,6 +3100,7 @@
               <w:rPr>
                 <w:shd w:val="nil" w:color="auto" w:fill="auto"/>
                 <w:rtl w:val="0"/>
+                <w:lang w:val="ru-RU"/>
               </w:rPr>
               <w:t>344,341</w:t>
             </w:r>
@@ -3045,7 +3112,7 @@
           <w:shd w:val="clear" w:color="auto" w:fill="ced7e7"/>
         </w:tblPrEx>
         <w:trPr>
-          <w:trHeight w:val="900" w:hRule="atLeast"/>
+          <w:trHeight w:val="910" w:hRule="atLeast"/>
         </w:trPr>
         <w:tc>
           <w:tcPr>
@@ -3077,6 +3144,7 @@
               <w:rPr>
                 <w:shd w:val="nil" w:color="auto" w:fill="auto"/>
                 <w:rtl w:val="0"/>
+                <w:lang w:val="ru-RU"/>
               </w:rPr>
               <w:t>Командний</w:t>
             </w:r>
@@ -3096,6 +3164,7 @@
               <w:rPr>
                 <w:shd w:val="nil" w:color="auto" w:fill="auto"/>
                 <w:rtl w:val="0"/>
+                <w:lang w:val="ru-RU"/>
               </w:rPr>
               <w:t>елімінаційний</w:t>
             </w:r>
@@ -3114,6 +3183,7 @@
               <w:rPr>
                 <w:shd w:val="nil" w:color="auto" w:fill="auto"/>
                 <w:rtl w:val="0"/>
+                <w:lang w:val="ru-RU"/>
               </w:rPr>
               <w:t>раунд М</w:t>
             </w:r>
@@ -3121,6 +3191,7 @@
               <w:rPr>
                 <w:shd w:val="nil" w:color="auto" w:fill="auto"/>
                 <w:rtl w:val="0"/>
+                <w:lang w:val="ru-RU"/>
               </w:rPr>
               <w:t>-1</w:t>
             </w:r>
@@ -3156,6 +3227,7 @@
               <w:rPr>
                 <w:shd w:val="nil" w:color="auto" w:fill="auto"/>
                 <w:rtl w:val="0"/>
+                <w:lang w:val="ru-RU"/>
               </w:rPr>
               <w:t>Львовський Дмитро</w:t>
             </w:r>
@@ -3174,6 +3246,7 @@
               <w:rPr>
                 <w:shd w:val="nil" w:color="auto" w:fill="auto"/>
                 <w:rtl w:val="0"/>
+                <w:lang w:val="ru-RU"/>
               </w:rPr>
               <w:t>Куріцина Діна</w:t>
             </w:r>
@@ -3205,23 +3278,25 @@
                 <w:b w:val="1"/>
                 <w:bCs w:val="1"/>
                 <w:shd w:val="nil" w:color="auto" w:fill="auto"/>
-              </w:rPr>
-            </w:pPr>
-          </w:p>
-          <w:p>
-            <w:pPr>
-              <w:pStyle w:val="Обычный"/>
-              <w:bidi w:val="0"/>
-              <w:ind w:left="0" w:right="0" w:firstLine="0"/>
-              <w:jc w:val="center"/>
-              <w:rPr>
-                <w:rtl w:val="0"/>
-              </w:rPr>
-            </w:pPr>
-            <w:r>
-              <w:rPr>
-                <w:shd w:val="nil" w:color="auto" w:fill="auto"/>
-                <w:rtl w:val="0"/>
+                <w:lang w:val="ru-RU"/>
+              </w:rPr>
+            </w:pPr>
+          </w:p>
+          <w:p>
+            <w:pPr>
+              <w:pStyle w:val="Обычный"/>
+              <w:bidi w:val="0"/>
+              <w:ind w:left="0" w:right="0" w:firstLine="0"/>
+              <w:jc w:val="center"/>
+              <w:rPr>
+                <w:rtl w:val="0"/>
+              </w:rPr>
+            </w:pPr>
+            <w:r>
+              <w:rPr>
+                <w:shd w:val="nil" w:color="auto" w:fill="auto"/>
+                <w:rtl w:val="0"/>
+                <w:lang w:val="ru-RU"/>
               </w:rPr>
               <w:t>22-26.06.2011</w:t>
             </w:r>
@@ -3257,6 +3332,7 @@
               <w:rPr>
                 <w:shd w:val="nil" w:color="auto" w:fill="auto"/>
                 <w:rtl w:val="0"/>
+                <w:lang w:val="ru-RU"/>
               </w:rPr>
               <w:t>Львів</w:t>
             </w:r>
@@ -3264,6 +3340,7 @@
               <w:rPr>
                 <w:shd w:val="nil" w:color="auto" w:fill="auto"/>
                 <w:rtl w:val="0"/>
+                <w:lang w:val="ru-RU"/>
               </w:rPr>
               <w:t>,</w:t>
             </w:r>
@@ -3283,6 +3360,7 @@
               <w:rPr>
                 <w:shd w:val="nil" w:color="auto" w:fill="auto"/>
                 <w:rtl w:val="0"/>
+                <w:lang w:val="ru-RU"/>
               </w:rPr>
               <w:t>Турнір пам’яті ЗТУ</w:t>
             </w:r>
@@ -3301,6 +3379,7 @@
               <w:rPr>
                 <w:shd w:val="nil" w:color="auto" w:fill="auto"/>
                 <w:rtl w:val="0"/>
+                <w:lang w:val="ru-RU"/>
               </w:rPr>
               <w:t>Б</w:t>
             </w:r>
@@ -3308,6 +3387,7 @@
               <w:rPr>
                 <w:shd w:val="nil" w:color="auto" w:fill="auto"/>
                 <w:rtl w:val="0"/>
+                <w:lang w:val="ru-RU"/>
               </w:rPr>
               <w:t>.</w:t>
             </w:r>
@@ -3315,6 +3395,7 @@
               <w:rPr>
                 <w:shd w:val="nil" w:color="auto" w:fill="auto"/>
                 <w:rtl w:val="0"/>
+                <w:lang w:val="ru-RU"/>
               </w:rPr>
               <w:t>Кокота</w:t>
             </w:r>
@@ -3344,23 +3425,25 @@
               <w:jc w:val="center"/>
               <w:rPr>
                 <w:shd w:val="nil" w:color="auto" w:fill="auto"/>
-              </w:rPr>
-            </w:pPr>
-          </w:p>
-          <w:p>
-            <w:pPr>
-              <w:pStyle w:val="Обычный"/>
-              <w:bidi w:val="0"/>
-              <w:ind w:left="0" w:right="0" w:firstLine="0"/>
-              <w:jc w:val="center"/>
-              <w:rPr>
-                <w:rtl w:val="0"/>
-              </w:rPr>
-            </w:pPr>
-            <w:r>
-              <w:rPr>
-                <w:shd w:val="nil" w:color="auto" w:fill="auto"/>
-                <w:rtl w:val="0"/>
+                <w:lang w:val="ru-RU"/>
+              </w:rPr>
+            </w:pPr>
+          </w:p>
+          <w:p>
+            <w:pPr>
+              <w:pStyle w:val="Обычный"/>
+              <w:bidi w:val="0"/>
+              <w:ind w:left="0" w:right="0" w:firstLine="0"/>
+              <w:jc w:val="center"/>
+              <w:rPr>
+                <w:rtl w:val="0"/>
+              </w:rPr>
+            </w:pPr>
+            <w:r>
+              <w:rPr>
+                <w:shd w:val="nil" w:color="auto" w:fill="auto"/>
+                <w:rtl w:val="0"/>
+                <w:lang w:val="ru-RU"/>
               </w:rPr>
               <w:t>Найти протокол біли ли миксти</w:t>
             </w:r>
@@ -3368,6 +3451,7 @@
               <w:rPr>
                 <w:shd w:val="nil" w:color="auto" w:fill="auto"/>
                 <w:rtl w:val="0"/>
+                <w:lang w:val="ru-RU"/>
               </w:rPr>
               <w:t>?</w:t>
             </w:r>
@@ -3399,6 +3483,7 @@
                 <w:b w:val="1"/>
                 <w:bCs w:val="1"/>
                 <w:shd w:val="nil" w:color="auto" w:fill="auto"/>
+                <w:lang w:val="ru-RU"/>
               </w:rPr>
             </w:pPr>
           </w:p>
@@ -3418,6 +3503,7 @@
                 <w:bCs w:val="1"/>
                 <w:shd w:val="nil" w:color="auto" w:fill="auto"/>
                 <w:rtl w:val="0"/>
+                <w:lang w:val="ru-RU"/>
               </w:rPr>
               <w:t>2752</w:t>
             </w:r>
@@ -3453,6 +3539,7 @@
               <w:rPr>
                 <w:shd w:val="nil" w:color="auto" w:fill="auto"/>
                 <w:rtl w:val="0"/>
+                <w:lang w:val="ru-RU"/>
               </w:rPr>
               <w:t>331,347,345,358</w:t>
             </w:r>
@@ -3471,6 +3558,7 @@
               <w:rPr>
                 <w:shd w:val="nil" w:color="auto" w:fill="auto"/>
                 <w:rtl w:val="0"/>
+                <w:lang w:val="ru-RU"/>
               </w:rPr>
               <w:t>331,345,340,355</w:t>
             </w:r>
@@ -3482,7 +3570,7 @@
           <w:shd w:val="clear" w:color="auto" w:fill="ced7e7"/>
         </w:tblPrEx>
         <w:trPr>
-          <w:trHeight w:val="900" w:hRule="atLeast"/>
+          <w:trHeight w:val="910" w:hRule="atLeast"/>
         </w:trPr>
         <w:tc>
           <w:tcPr>
@@ -3514,6 +3602,7 @@
               <w:rPr>
                 <w:shd w:val="nil" w:color="auto" w:fill="auto"/>
                 <w:rtl w:val="0"/>
+                <w:lang w:val="ru-RU"/>
               </w:rPr>
               <w:t xml:space="preserve">Фінали </w:t>
             </w:r>
@@ -3521,6 +3610,7 @@
               <w:rPr>
                 <w:shd w:val="nil" w:color="auto" w:fill="auto"/>
                 <w:rtl w:val="0"/>
+                <w:lang w:val="ru-RU"/>
               </w:rPr>
               <w:t>50</w:t>
             </w:r>
@@ -3528,6 +3618,7 @@
               <w:rPr>
                 <w:shd w:val="nil" w:color="auto" w:fill="auto"/>
                 <w:rtl w:val="0"/>
+                <w:lang w:val="ru-RU"/>
               </w:rPr>
               <w:t>м</w:t>
             </w:r>
@@ -3546,6 +3637,7 @@
               <w:rPr>
                 <w:shd w:val="nil" w:color="auto" w:fill="auto"/>
                 <w:rtl w:val="0"/>
+                <w:lang w:val="ru-RU"/>
               </w:rPr>
               <w:t xml:space="preserve">16 </w:t>
             </w:r>
@@ -3553,6 +3645,7 @@
               <w:rPr>
                 <w:shd w:val="nil" w:color="auto" w:fill="auto"/>
                 <w:rtl w:val="0"/>
+                <w:lang w:val="ru-RU"/>
               </w:rPr>
               <w:t>стр</w:t>
             </w:r>
@@ -3560,6 +3653,7 @@
               <w:rPr>
                 <w:shd w:val="nil" w:color="auto" w:fill="auto"/>
                 <w:rtl w:val="0"/>
+                <w:lang w:val="ru-RU"/>
               </w:rPr>
               <w:t>.</w:t>
             </w:r>
@@ -3587,34 +3681,14 @@
             <w:pPr>
               <w:pStyle w:val="Обычный"/>
               <w:jc w:val="center"/>
-              <w:rPr>
-                <w:shd w:val="nil" w:color="auto" w:fill="auto"/>
-              </w:rPr>
-            </w:pPr>
-            <w:r>
-              <w:rPr>
-                <w:shd w:val="nil" w:color="auto" w:fill="auto"/>
-                <w:rtl w:val="0"/>
-              </w:rPr>
-              <w:t xml:space="preserve">Степура Юлія </w:t>
-            </w:r>
-          </w:p>
-          <w:p>
-            <w:pPr>
-              <w:pStyle w:val="Обычный"/>
-              <w:bidi w:val="0"/>
-              <w:ind w:left="0" w:right="0" w:firstLine="0"/>
-              <w:jc w:val="center"/>
-              <w:rPr>
-                <w:rtl w:val="0"/>
-              </w:rPr>
-            </w:pPr>
-            <w:r>
-              <w:rPr>
-                <w:shd w:val="nil" w:color="auto" w:fill="auto"/>
-                <w:rtl w:val="0"/>
-              </w:rPr>
-              <w:t>Вдовенко Віталій</w:t>
+            </w:pPr>
+            <w:r>
+              <w:rPr>
+                <w:shd w:val="nil" w:color="auto" w:fill="auto"/>
+                <w:rtl w:val="0"/>
+                <w:lang w:val="ru-RU"/>
+              </w:rPr>
+              <w:t>Шкляр Ксенія Вдовенко Віталій</w:t>
             </w:r>
           </w:p>
         </w:tc>
@@ -3644,25 +3718,83 @@
                 <w:b w:val="1"/>
                 <w:bCs w:val="1"/>
                 <w:shd w:val="nil" w:color="auto" w:fill="auto"/>
-              </w:rPr>
-            </w:pPr>
-          </w:p>
-          <w:p>
-            <w:pPr>
-              <w:pStyle w:val="Обычный"/>
-              <w:bidi w:val="0"/>
-              <w:ind w:left="0" w:right="0" w:firstLine="0"/>
-              <w:jc w:val="center"/>
-              <w:rPr>
-                <w:rtl w:val="0"/>
-              </w:rPr>
-            </w:pPr>
-            <w:r>
-              <w:rPr>
-                <w:shd w:val="nil" w:color="auto" w:fill="auto"/>
-                <w:rtl w:val="0"/>
-              </w:rPr>
-              <w:t>20-24.09.2023</w:t>
+                <w:lang w:val="ru-RU"/>
+              </w:rPr>
+            </w:pPr>
+          </w:p>
+          <w:p>
+            <w:pPr>
+              <w:pStyle w:val="Обычный"/>
+              <w:bidi w:val="0"/>
+              <w:ind w:left="0" w:right="0" w:firstLine="0"/>
+              <w:jc w:val="center"/>
+              <w:rPr>
+                <w:rtl w:val="0"/>
+              </w:rPr>
+            </w:pPr>
+            <w:r>
+              <w:rPr>
+                <w:shd w:val="nil" w:color="auto" w:fill="auto"/>
+                <w:rtl w:val="0"/>
+                <w:lang w:val="ru-RU"/>
+              </w:rPr>
+              <w:t>1</w:t>
+            </w:r>
+            <w:r>
+              <w:rPr>
+                <w:shd w:val="nil" w:color="auto" w:fill="auto"/>
+                <w:rtl w:val="0"/>
+                <w:lang w:val="ru-RU"/>
+              </w:rPr>
+              <w:t>1</w:t>
+            </w:r>
+            <w:r>
+              <w:rPr>
+                <w:shd w:val="nil" w:color="auto" w:fill="auto"/>
+                <w:rtl w:val="0"/>
+                <w:lang w:val="ru-RU"/>
+              </w:rPr>
+              <w:t>-</w:t>
+            </w:r>
+            <w:r>
+              <w:rPr>
+                <w:shd w:val="nil" w:color="auto" w:fill="auto"/>
+                <w:rtl w:val="0"/>
+                <w:lang w:val="ru-RU"/>
+              </w:rPr>
+              <w:t>1</w:t>
+            </w:r>
+            <w:r>
+              <w:rPr>
+                <w:shd w:val="nil" w:color="auto" w:fill="auto"/>
+                <w:rtl w:val="0"/>
+                <w:lang w:val="ru-RU"/>
+              </w:rPr>
+              <w:t>4.0</w:t>
+            </w:r>
+            <w:r>
+              <w:rPr>
+                <w:shd w:val="nil" w:color="auto" w:fill="auto"/>
+                <w:rtl w:val="0"/>
+                <w:lang w:val="ru-RU"/>
+              </w:rPr>
+              <w:t>8</w:t>
+            </w:r>
+            <w:r>
+              <w:rPr>
+                <w:shd w:val="nil" w:color="auto" w:fill="auto"/>
+                <w:rtl w:val="0"/>
+                <w:lang w:val="ru-RU"/>
+              </w:rPr>
+              <w:t>.202</w:t>
+            </w:r>
+            <w:r>
+              <w:rPr>
+                <w:shd w:val="nil" w:color="auto" w:fill="auto"/>
+                <w:rtl w:val="0"/>
+                <w:lang w:val="ru-RU"/>
+              </w:rPr>
+              <w:t>6</w:t>
             </w:r>
           </w:p>
         </w:tc>
@@ -3690,24 +3822,26 @@
               <w:jc w:val="center"/>
               <w:rPr>
                 <w:shd w:val="nil" w:color="auto" w:fill="auto"/>
-              </w:rPr>
-            </w:pPr>
-          </w:p>
-          <w:p>
-            <w:pPr>
-              <w:pStyle w:val="Обычный"/>
-              <w:bidi w:val="0"/>
-              <w:ind w:left="0" w:right="0" w:firstLine="0"/>
-              <w:jc w:val="center"/>
-              <w:rPr>
-                <w:shd w:val="nil" w:color="auto" w:fill="auto"/>
-                <w:rtl w:val="0"/>
-              </w:rPr>
-            </w:pPr>
-            <w:r>
-              <w:rPr>
-                <w:shd w:val="nil" w:color="auto" w:fill="auto"/>
-                <w:rtl w:val="0"/>
+                <w:lang w:val="ru-RU"/>
+              </w:rPr>
+            </w:pPr>
+          </w:p>
+          <w:p>
+            <w:pPr>
+              <w:pStyle w:val="Обычный"/>
+              <w:bidi w:val="0"/>
+              <w:ind w:left="0" w:right="0" w:firstLine="0"/>
+              <w:jc w:val="center"/>
+              <w:rPr>
+                <w:shd w:val="nil" w:color="auto" w:fill="auto"/>
+                <w:rtl w:val="0"/>
+              </w:rPr>
+            </w:pPr>
+            <w:r>
+              <w:rPr>
+                <w:shd w:val="nil" w:color="auto" w:fill="auto"/>
+                <w:rtl w:val="0"/>
+                <w:lang w:val="ru-RU"/>
               </w:rPr>
               <w:t>Львів</w:t>
             </w:r>
@@ -3726,6 +3860,7 @@
               <w:rPr>
                 <w:shd w:val="nil" w:color="auto" w:fill="auto"/>
                 <w:rtl w:val="0"/>
+                <w:lang w:val="ru-RU"/>
               </w:rPr>
               <w:t>Чемпіонат України</w:t>
             </w:r>
@@ -3755,39 +3890,51 @@
               <w:jc w:val="center"/>
               <w:rPr>
                 <w:shd w:val="nil" w:color="auto" w:fill="auto"/>
-              </w:rPr>
-            </w:pPr>
-          </w:p>
-          <w:p>
-            <w:pPr>
-              <w:pStyle w:val="Обычный"/>
-              <w:bidi w:val="0"/>
-              <w:ind w:left="0" w:right="0" w:firstLine="0"/>
-              <w:jc w:val="center"/>
-              <w:rPr>
-                <w:rtl w:val="0"/>
-              </w:rPr>
-            </w:pPr>
-            <w:r>
-              <w:rPr>
-                <w:shd w:val="nil" w:color="auto" w:fill="auto"/>
-                <w:rtl w:val="0"/>
-              </w:rPr>
-              <w:t>«Фслк»</w:t>
-            </w:r>
-            <w:r>
-              <w:rPr>
-                <w:shd w:val="nil" w:color="auto" w:fill="auto"/>
-                <w:rtl w:val="0"/>
-              </w:rPr>
-              <w:t xml:space="preserve">, </w:t>
-            </w:r>
-            <w:r>
-              <w:rPr>
-                <w:shd w:val="nil" w:color="auto" w:fill="auto"/>
-                <w:rtl w:val="0"/>
-              </w:rPr>
-              <w:t>Київ</w:t>
+                <w:lang w:val="ru-RU"/>
+              </w:rPr>
+            </w:pPr>
+          </w:p>
+          <w:p>
+            <w:pPr>
+              <w:pStyle w:val="Обычный"/>
+              <w:bidi w:val="0"/>
+              <w:ind w:left="0" w:right="0" w:firstLine="0"/>
+              <w:jc w:val="center"/>
+              <w:rPr>
+                <w:rtl w:val="0"/>
+              </w:rPr>
+            </w:pPr>
+            <w:r>
+              <w:rPr>
+                <w:shd w:val="nil" w:color="auto" w:fill="auto"/>
+                <w:rtl w:val="0"/>
+                <w:lang w:val="ru-RU"/>
+              </w:rPr>
+              <w:t xml:space="preserve">стадіон </w:t>
+            </w:r>
+            <w:r>
+              <w:rPr>
+                <w:shd w:val="nil" w:color="auto" w:fill="auto"/>
+                <w:rtl w:val="0"/>
+                <w:lang w:val="ru-RU"/>
+              </w:rPr>
+              <w:t>"</w:t>
+            </w:r>
+            <w:r>
+              <w:rPr>
+                <w:shd w:val="nil" w:color="auto" w:fill="auto"/>
+                <w:rtl w:val="0"/>
+                <w:lang w:val="ru-RU"/>
+              </w:rPr>
+              <w:t>Динамо</w:t>
+            </w:r>
+            <w:r>
+              <w:rPr>
+                <w:shd w:val="nil" w:color="auto" w:fill="auto"/>
+                <w:rtl w:val="0"/>
+                <w:lang w:val="ru-RU"/>
+              </w:rPr>
+              <w:t>"</w:t>
             </w:r>
           </w:p>
         </w:tc>
@@ -3817,6 +3964,7 @@
                 <w:b w:val="1"/>
                 <w:bCs w:val="1"/>
                 <w:shd w:val="nil" w:color="auto" w:fill="auto"/>
+                <w:lang w:val="ru-RU"/>
               </w:rPr>
             </w:pPr>
           </w:p>
@@ -3836,8 +3984,19 @@
                 <w:bCs w:val="1"/>
                 <w:shd w:val="nil" w:color="auto" w:fill="auto"/>
                 <w:rtl w:val="0"/>
-              </w:rPr>
-              <w:t>156</w:t>
+                <w:lang w:val="ru-RU"/>
+              </w:rPr>
+              <w:t>15</w:t>
+            </w:r>
+            <w:r>
+              <w:rPr>
+                <w:b w:val="1"/>
+                <w:bCs w:val="1"/>
+                <w:shd w:val="nil" w:color="auto" w:fill="auto"/>
+                <w:rtl w:val="0"/>
+                <w:lang w:val="ru-RU"/>
+              </w:rPr>
+              <w:t>7</w:t>
             </w:r>
           </w:p>
         </w:tc>
@@ -3865,23 +4024,25 @@
               <w:jc w:val="center"/>
               <w:rPr>
                 <w:shd w:val="nil" w:color="auto" w:fill="auto"/>
-              </w:rPr>
-            </w:pPr>
-          </w:p>
-          <w:p>
-            <w:pPr>
-              <w:pStyle w:val="Обычный"/>
-              <w:bidi w:val="0"/>
-              <w:ind w:left="0" w:right="0" w:firstLine="0"/>
-              <w:jc w:val="center"/>
-              <w:rPr>
-                <w:rtl w:val="0"/>
-              </w:rPr>
-            </w:pPr>
-            <w:r>
-              <w:rPr>
-                <w:shd w:val="nil" w:color="auto" w:fill="auto"/>
-                <w:rtl w:val="0"/>
+                <w:lang w:val="ru-RU"/>
+              </w:rPr>
+            </w:pPr>
+          </w:p>
+          <w:p>
+            <w:pPr>
+              <w:pStyle w:val="Обычный"/>
+              <w:bidi w:val="0"/>
+              <w:ind w:left="0" w:right="0" w:firstLine="0"/>
+              <w:jc w:val="center"/>
+              <w:rPr>
+                <w:rtl w:val="0"/>
+              </w:rPr>
+            </w:pPr>
+            <w:r>
+              <w:rPr>
+                <w:shd w:val="nil" w:color="auto" w:fill="auto"/>
+                <w:rtl w:val="0"/>
+                <w:lang w:val="ru-RU"/>
               </w:rPr>
               <w:t>----</w:t>
             </w:r>
@@ -3893,7 +4054,7 @@
           <w:shd w:val="clear" w:color="auto" w:fill="ced7e7"/>
         </w:tblPrEx>
         <w:trPr>
-          <w:trHeight w:val="900" w:hRule="atLeast"/>
+          <w:trHeight w:val="910" w:hRule="atLeast"/>
         </w:trPr>
         <w:tc>
           <w:tcPr>
@@ -3925,6 +4086,7 @@
               <w:rPr>
                 <w:shd w:val="nil" w:color="auto" w:fill="auto"/>
                 <w:rtl w:val="0"/>
+                <w:lang w:val="ru-RU"/>
               </w:rPr>
               <w:t xml:space="preserve">Фінали </w:t>
             </w:r>
@@ -3932,6 +4094,7 @@
               <w:rPr>
                 <w:shd w:val="nil" w:color="auto" w:fill="auto"/>
                 <w:rtl w:val="0"/>
+                <w:lang w:val="ru-RU"/>
               </w:rPr>
               <w:t>70</w:t>
             </w:r>
@@ -3939,6 +4102,7 @@
               <w:rPr>
                 <w:shd w:val="nil" w:color="auto" w:fill="auto"/>
                 <w:rtl w:val="0"/>
+                <w:lang w:val="ru-RU"/>
               </w:rPr>
               <w:t>м</w:t>
             </w:r>
@@ -3957,6 +4121,7 @@
               <w:rPr>
                 <w:shd w:val="nil" w:color="auto" w:fill="auto"/>
                 <w:rtl w:val="0"/>
+                <w:lang w:val="ru-RU"/>
               </w:rPr>
               <w:t xml:space="preserve">16 </w:t>
             </w:r>
@@ -3964,6 +4129,7 @@
               <w:rPr>
                 <w:shd w:val="nil" w:color="auto" w:fill="auto"/>
                 <w:rtl w:val="0"/>
+                <w:lang w:val="ru-RU"/>
               </w:rPr>
               <w:t>стр</w:t>
             </w:r>
@@ -3971,6 +4137,7 @@
               <w:rPr>
                 <w:shd w:val="nil" w:color="auto" w:fill="auto"/>
                 <w:rtl w:val="0"/>
+                <w:lang w:val="ru-RU"/>
               </w:rPr>
               <w:t>.</w:t>
             </w:r>
@@ -4006,6 +4173,7 @@
               <w:rPr>
                 <w:shd w:val="nil" w:color="auto" w:fill="auto"/>
                 <w:rtl w:val="0"/>
+                <w:lang w:val="ru-RU"/>
               </w:rPr>
               <w:t>Скальська Ірина</w:t>
             </w:r>
@@ -4024,6 +4192,7 @@
               <w:rPr>
                 <w:shd w:val="nil" w:color="auto" w:fill="auto"/>
                 <w:rtl w:val="0"/>
+                <w:lang w:val="ru-RU"/>
               </w:rPr>
               <w:t>Соколов Олександр</w:t>
             </w:r>
@@ -4055,23 +4224,25 @@
                 <w:b w:val="1"/>
                 <w:bCs w:val="1"/>
                 <w:shd w:val="nil" w:color="auto" w:fill="auto"/>
-              </w:rPr>
-            </w:pPr>
-          </w:p>
-          <w:p>
-            <w:pPr>
-              <w:pStyle w:val="Обычный"/>
-              <w:bidi w:val="0"/>
-              <w:ind w:left="0" w:right="0" w:firstLine="0"/>
-              <w:jc w:val="center"/>
-              <w:rPr>
-                <w:rtl w:val="0"/>
-              </w:rPr>
-            </w:pPr>
-            <w:r>
-              <w:rPr>
-                <w:shd w:val="nil" w:color="auto" w:fill="auto"/>
-                <w:rtl w:val="0"/>
+                <w:lang w:val="ru-RU"/>
+              </w:rPr>
+            </w:pPr>
+          </w:p>
+          <w:p>
+            <w:pPr>
+              <w:pStyle w:val="Обычный"/>
+              <w:bidi w:val="0"/>
+              <w:ind w:left="0" w:right="0" w:firstLine="0"/>
+              <w:jc w:val="center"/>
+              <w:rPr>
+                <w:rtl w:val="0"/>
+              </w:rPr>
+            </w:pPr>
+            <w:r>
+              <w:rPr>
+                <w:shd w:val="nil" w:color="auto" w:fill="auto"/>
+                <w:rtl w:val="0"/>
+                <w:lang w:val="ru-RU"/>
               </w:rPr>
               <w:t>23-30.06.2012</w:t>
             </w:r>
@@ -4107,6 +4278,7 @@
               <w:rPr>
                 <w:shd w:val="nil" w:color="auto" w:fill="auto"/>
                 <w:rtl w:val="0"/>
+                <w:lang w:val="ru-RU"/>
               </w:rPr>
               <w:t>Львів</w:t>
             </w:r>
@@ -4114,6 +4286,7 @@
               <w:rPr>
                 <w:shd w:val="nil" w:color="auto" w:fill="auto"/>
                 <w:rtl w:val="0"/>
+                <w:lang w:val="ru-RU"/>
               </w:rPr>
               <w:t>,</w:t>
             </w:r>
@@ -4132,6 +4305,7 @@
               <w:rPr>
                 <w:shd w:val="nil" w:color="auto" w:fill="auto"/>
                 <w:rtl w:val="0"/>
+                <w:lang w:val="ru-RU"/>
               </w:rPr>
               <w:t>Турнір пам’яті ЗТУ Б</w:t>
             </w:r>
@@ -4139,6 +4313,7 @@
               <w:rPr>
                 <w:shd w:val="nil" w:color="auto" w:fill="auto"/>
                 <w:rtl w:val="0"/>
+                <w:lang w:val="ru-RU"/>
               </w:rPr>
               <w:t>.</w:t>
             </w:r>
@@ -4146,6 +4321,7 @@
               <w:rPr>
                 <w:shd w:val="nil" w:color="auto" w:fill="auto"/>
                 <w:rtl w:val="0"/>
+                <w:lang w:val="ru-RU"/>
               </w:rPr>
               <w:t>Кокота</w:t>
             </w:r>
@@ -4175,23 +4351,25 @@
               <w:jc w:val="center"/>
               <w:rPr>
                 <w:shd w:val="nil" w:color="auto" w:fill="auto"/>
-              </w:rPr>
-            </w:pPr>
-          </w:p>
-          <w:p>
-            <w:pPr>
-              <w:pStyle w:val="Обычный"/>
-              <w:bidi w:val="0"/>
-              <w:ind w:left="0" w:right="0" w:firstLine="0"/>
-              <w:jc w:val="center"/>
-              <w:rPr>
-                <w:rtl w:val="0"/>
-              </w:rPr>
-            </w:pPr>
-            <w:r>
-              <w:rPr>
-                <w:shd w:val="nil" w:color="auto" w:fill="auto"/>
-                <w:rtl w:val="0"/>
+                <w:lang w:val="ru-RU"/>
+              </w:rPr>
+            </w:pPr>
+          </w:p>
+          <w:p>
+            <w:pPr>
+              <w:pStyle w:val="Обычный"/>
+              <w:bidi w:val="0"/>
+              <w:ind w:left="0" w:right="0" w:firstLine="0"/>
+              <w:jc w:val="center"/>
+              <w:rPr>
+                <w:rtl w:val="0"/>
+              </w:rPr>
+            </w:pPr>
+            <w:r>
+              <w:rPr>
+                <w:shd w:val="nil" w:color="auto" w:fill="auto"/>
+                <w:rtl w:val="0"/>
+                <w:lang w:val="ru-RU"/>
               </w:rPr>
               <w:t>СДЮШОР «Електрон»</w:t>
             </w:r>
@@ -4199,6 +4377,7 @@
               <w:rPr>
                 <w:shd w:val="nil" w:color="auto" w:fill="auto"/>
                 <w:rtl w:val="0"/>
+                <w:lang w:val="ru-RU"/>
               </w:rPr>
               <w:t>,</w:t>
             </w:r>
@@ -4206,6 +4385,7 @@
               <w:rPr>
                 <w:shd w:val="nil" w:color="auto" w:fill="auto"/>
                 <w:rtl w:val="0"/>
+                <w:lang w:val="ru-RU"/>
               </w:rPr>
               <w:t>Львів</w:t>
             </w:r>
@@ -4237,6 +4417,7 @@
                 <w:b w:val="1"/>
                 <w:bCs w:val="1"/>
                 <w:shd w:val="nil" w:color="auto" w:fill="auto"/>
+                <w:lang w:val="ru-RU"/>
               </w:rPr>
             </w:pPr>
           </w:p>
@@ -4256,6 +4437,7 @@
                 <w:bCs w:val="1"/>
                 <w:shd w:val="nil" w:color="auto" w:fill="auto"/>
                 <w:rtl w:val="0"/>
+                <w:lang w:val="ru-RU"/>
               </w:rPr>
               <w:t>152</w:t>
             </w:r>
@@ -4285,23 +4467,25 @@
               <w:jc w:val="center"/>
               <w:rPr>
                 <w:shd w:val="nil" w:color="auto" w:fill="auto"/>
-              </w:rPr>
-            </w:pPr>
-          </w:p>
-          <w:p>
-            <w:pPr>
-              <w:pStyle w:val="Обычный"/>
-              <w:bidi w:val="0"/>
-              <w:ind w:left="0" w:right="0" w:firstLine="0"/>
-              <w:jc w:val="center"/>
-              <w:rPr>
-                <w:rtl w:val="0"/>
-              </w:rPr>
-            </w:pPr>
-            <w:r>
-              <w:rPr>
-                <w:shd w:val="nil" w:color="auto" w:fill="auto"/>
-                <w:rtl w:val="0"/>
+                <w:lang w:val="ru-RU"/>
+              </w:rPr>
+            </w:pPr>
+          </w:p>
+          <w:p>
+            <w:pPr>
+              <w:pStyle w:val="Обычный"/>
+              <w:bidi w:val="0"/>
+              <w:ind w:left="0" w:right="0" w:firstLine="0"/>
+              <w:jc w:val="center"/>
+              <w:rPr>
+                <w:rtl w:val="0"/>
+              </w:rPr>
+            </w:pPr>
+            <w:r>
+              <w:rPr>
+                <w:shd w:val="nil" w:color="auto" w:fill="auto"/>
+                <w:rtl w:val="0"/>
+                <w:lang w:val="ru-RU"/>
               </w:rPr>
               <w:t>----</w:t>
             </w:r>
@@ -4313,6 +4497,7 @@
       <w:pPr>
         <w:pStyle w:val="Обычный"/>
         <w:widowControl w:val="0"/>
+        <w:ind w:left="108" w:hanging="108"/>
         <w:jc w:val="center"/>
       </w:pPr>
       <w:r>
@@ -4692,13 +4877,7 @@
           <a:effectLst/>
         </a:effectStyle>
         <a:effectStyle>
-          <a:effectLst>
-            <a:outerShdw sx="100000" sy="100000" kx="0" ky="0" algn="b" rotWithShape="0" blurRad="38100" dist="20000" dir="5400000">
-              <a:srgbClr val="000000">
-                <a:alpha val="38000"/>
-              </a:srgbClr>
-            </a:outerShdw>
-          </a:effectLst>
+          <a:effectLst/>
         </a:effectStyle>
       </a:effectStyleLst>
       <a:bgFillStyleLst>
@@ -4797,10 +4976,10 @@
             </a:solidFill>
             <a:effectLst/>
             <a:uFillTx/>
-            <a:latin typeface="Cambria"/>
-            <a:ea typeface="Cambria"/>
-            <a:cs typeface="Cambria"/>
-            <a:sym typeface="Cambria"/>
+            <a:latin typeface="+mn-lt"/>
+            <a:ea typeface="+mn-ea"/>
+            <a:cs typeface="+mn-cs"/>
+            <a:sym typeface="Helvetica Neue"/>
           </a:defRPr>
         </a:defPPr>
         <a:lvl1pPr marL="0" marR="0" indent="0" algn="l" defTabSz="914400" rtl="0" fontAlgn="auto" latinLnBrk="1" hangingPunct="0">
@@ -5055,13 +5234,7 @@
           <a:prstDash val="solid"/>
           <a:round/>
         </a:ln>
-        <a:effectLst>
-          <a:outerShdw sx="100000" sy="100000" kx="0" ky="0" algn="b" rotWithShape="0" blurRad="38100" dist="20000" dir="5400000">
-            <a:srgbClr val="000000">
-              <a:alpha val="38000"/>
-            </a:srgbClr>
-          </a:outerShdw>
-        </a:effectLst>
+        <a:effectLst/>
         <a:sp3d/>
       </a:spPr>
       <a:bodyPr rot="0" spcFirstLastPara="1" vertOverflow="overflow" horzOverflow="overflow" vert="horz" wrap="square" lIns="91439" tIns="45719" rIns="91439" bIns="45719" numCol="1" spcCol="38100" rtlCol="0" anchor="t" upright="0">
@@ -5374,10 +5547,10 @@
             </a:solidFill>
             <a:effectLst/>
             <a:uFillTx/>
-            <a:latin typeface="Cambria"/>
-            <a:ea typeface="Cambria"/>
-            <a:cs typeface="Cambria"/>
-            <a:sym typeface="Cambria"/>
+            <a:latin typeface="+mn-lt"/>
+            <a:ea typeface="+mn-ea"/>
+            <a:cs typeface="+mn-cs"/>
+            <a:sym typeface="Helvetica Neue"/>
           </a:defRPr>
         </a:defPPr>
         <a:lvl1pPr marL="0" marR="0" indent="0" algn="l" defTabSz="914400" rtl="0" fontAlgn="auto" latinLnBrk="1" hangingPunct="0">

</xml_diff>

<commit_message>
update binary file for mixed teams records
</commit_message>
<xml_diff>
--- a/_data/records/records_mixed_teams.docx
+++ b/_data/records/records_mixed_teams.docx
@@ -3681,14 +3681,42 @@
             <w:pPr>
               <w:pStyle w:val="Обычный"/>
               <w:jc w:val="center"/>
-            </w:pPr>
-            <w:r>
-              <w:rPr>
-                <w:shd w:val="nil" w:color="auto" w:fill="auto"/>
-                <w:rtl w:val="0"/>
-                <w:lang w:val="ru-RU"/>
-              </w:rPr>
-              <w:t>Шкляр Ксенія Вдовенко Віталій</w:t>
+              <w:rPr>
+                <w:shd w:val="nil" w:color="auto" w:fill="auto"/>
+                <w:lang w:val="ru-RU"/>
+              </w:rPr>
+            </w:pPr>
+            <w:r>
+              <w:rPr>
+                <w:shd w:val="nil" w:color="auto" w:fill="auto"/>
+                <w:rtl w:val="0"/>
+                <w:lang w:val="ru-RU"/>
+              </w:rPr>
+              <w:t xml:space="preserve">Шкляр Ксенія </w:t>
+            </w:r>
+          </w:p>
+          <w:p>
+            <w:pPr>
+              <w:pStyle w:val="Обычный"/>
+              <w:jc w:val="center"/>
+              <w:rPr>
+                <w:shd w:val="nil" w:color="auto" w:fill="auto"/>
+                <w:lang w:val="ru-RU"/>
+              </w:rPr>
+            </w:pPr>
+          </w:p>
+          <w:p>
+            <w:pPr>
+              <w:pStyle w:val="Обычный"/>
+              <w:jc w:val="center"/>
+            </w:pPr>
+            <w:r>
+              <w:rPr>
+                <w:shd w:val="nil" w:color="auto" w:fill="auto"/>
+                <w:rtl w:val="0"/>
+                <w:lang w:val="ru-RU"/>
+              </w:rPr>
+              <w:t>Вдовенко Віталій</w:t>
             </w:r>
           </w:p>
         </w:tc>

</xml_diff>